<commit_message>
Match Q1 schematics to all 23 traction and 16 hydraulic PPT labels and highlight safety components
</commit_message>
<xml_diff>
--- a/downloads/PIA5704/PIA5704_Q1_Answer_Clear.docx
+++ b/downloads/PIA5704/PIA5704_Q1_Answer_Clear.docx
@@ -20,12 +20,12 @@
     </w:p>
     <w:p>
       <w:r>
-        <w:t>典型电力曳引式升降机由驱动电动机带动曳引轮，通过曳引轮与悬吊绳之间的摩擦传递驱动力，使轿厢与对重反向移动。对重平衡轿厢及部分载荷重量，因此驱动电动机主要克服不平衡负载和摩擦。以下以有齿轮式布置说明。</w:t>
+        <w:t>电力曳引式升降机由驱动电动机带动曳引轮，利用曳引轮与悬吊绳之间的摩擦传递驱动力。悬吊绳连接轿厢和对重，使两者沿各自导轨反向移动。对重平衡轿厢及部分载荷重量，从而减少不平衡负载及所需驱动功率。</w:t>
       </w:r>
     </w:p>
     <w:p>
       <w:r>
-        <w:t>A typical electric traction lift uses a drive motor to turn a drive sheave. Friction between the drive sheave and suspension rope moves the car and counterweight in opposite directions. The counterweight balances the car and part of its load, so the drive motor mainly overcomes the unbalanced load and friction. The arrangement described here is geared.</w:t>
+        <w:t>An electric traction lift uses a Drive motor to rotate a Drive sheave. Friction between the Drive sheave and Suspension rope transmits the driving force. The Suspension rope connects the Car and Counterweight so that they move in opposite directions along their guide rails. The Counterweight balances the Car and part of its load, reducing the unbalanced load and driving power required.</w:t>
       </w:r>
     </w:p>
     <w:tbl>
@@ -36,9 +36,9 @@
         <w:tblLook w:firstColumn="1" w:firstRow="1" w:lastColumn="0" w:lastRow="0" w:noHBand="0" w:noVBand="1" w:val="04A0"/>
       </w:tblPr>
       <w:tblGrid>
-        <w:gridCol w:w="3175"/>
-        <w:gridCol w:w="2835"/>
-        <w:gridCol w:w="4309"/>
+        <w:gridCol w:w="3288"/>
+        <w:gridCol w:w="2750"/>
+        <w:gridCol w:w="4337"/>
       </w:tblGrid>
       <w:tr>
         <w:trPr>
@@ -46,19 +46,19 @@
         </w:trPr>
         <w:tc>
           <w:tcPr>
-            <w:tcW w:type="dxa" w:w="3175"/>
-            <w:shd w:fill="E5EDF3"/>
+            <w:tcW w:type="dxa" w:w="3288"/>
+            <w:shd w:fill="E7EDF2"/>
           </w:tcPr>
           <w:p>
             <w:r>
-              <w:t>主要部件 / Major component</w:t>
+              <w:t>部件 / Component</w:t>
             </w:r>
           </w:p>
         </w:tc>
         <w:tc>
           <w:tcPr>
-            <w:tcW w:type="dxa" w:w="2835"/>
-            <w:shd w:fill="E5EDF3"/>
+            <w:tcW w:type="dxa" w:w="2750"/>
+            <w:shd w:fill="E7EDF2"/>
           </w:tcPr>
           <w:p>
             <w:r>
@@ -68,8 +68,8 @@
         </w:tc>
         <w:tc>
           <w:tcPr>
-            <w:tcW w:type="dxa" w:w="4309"/>
-            <w:shd w:fill="E5EDF3"/>
+            <w:tcW w:type="dxa" w:w="4337"/>
+            <w:shd w:fill="E7EDF2"/>
           </w:tcPr>
           <w:p>
             <w:r>
@@ -84,51 +84,51 @@
         </w:trPr>
         <w:tc>
           <w:tcPr>
-            <w:tcW w:type="dxa" w:w="3175"/>
+            <w:tcW w:type="dxa" w:w="3288"/>
           </w:tcPr>
           <w:p>
             <w:pPr>
-              <w:spacing w:before="40" w:after="60" w:line="252" w:lineRule="auto"/>
+              <w:spacing w:before="40" w:after="60" w:line="247" w:lineRule="auto"/>
             </w:pPr>
             <w:r>
               <w:rPr>
-                <w:sz w:val="19"/>
+                <w:sz w:val="18"/>
               </w:rPr>
-              <w:t>驱动电动机</w:t>
+              <w:t>控制器</w:t>
               <w:br/>
-              <w:t>Drive motor</w:t>
+              <w:t>Controller</w:t>
             </w:r>
           </w:p>
         </w:tc>
         <w:tc>
           <w:tcPr>
-            <w:tcW w:type="dxa" w:w="2835"/>
+            <w:tcW w:type="dxa" w:w="2750"/>
           </w:tcPr>
           <w:p>
             <w:pPr>
-              <w:spacing w:before="40" w:after="60" w:line="252" w:lineRule="auto"/>
+              <w:spacing w:before="40" w:after="60" w:line="247" w:lineRule="auto"/>
             </w:pPr>
             <w:r>
               <w:rPr>
-                <w:sz w:val="19"/>
+                <w:sz w:val="18"/>
               </w:rPr>
-              <w:t>提供升降机运行的动力。</w:t>
+              <w:t>接收层站按钮指令，协调驱动电动机、制动器、停车、平层和门机。</w:t>
             </w:r>
           </w:p>
         </w:tc>
         <w:tc>
           <w:tcPr>
-            <w:tcW w:type="dxa" w:w="4309"/>
+            <w:tcW w:type="dxa" w:w="4337"/>
           </w:tcPr>
           <w:p>
             <w:pPr>
-              <w:spacing w:before="40" w:after="60" w:line="252" w:lineRule="auto"/>
+              <w:spacing w:before="40" w:after="60" w:line="247" w:lineRule="auto"/>
             </w:pPr>
             <w:r>
               <w:rPr>
-                <w:sz w:val="19"/>
+                <w:sz w:val="18"/>
               </w:rPr>
-              <w:t>Supplies power to operate the lift.</w:t>
+              <w:t>Receives calls from the Landing pushbutton and coordinates the Drive motor, Brake, stopping, levelling and Door operator.</w:t>
             </w:r>
           </w:p>
         </w:tc>
@@ -139,51 +139,51 @@
         </w:trPr>
         <w:tc>
           <w:tcPr>
-            <w:tcW w:type="dxa" w:w="3175"/>
+            <w:tcW w:type="dxa" w:w="3288"/>
           </w:tcPr>
           <w:p>
             <w:pPr>
-              <w:spacing w:before="40" w:after="60" w:line="252" w:lineRule="auto"/>
+              <w:spacing w:before="40" w:after="60" w:line="247" w:lineRule="auto"/>
             </w:pPr>
             <w:r>
               <w:rPr>
-                <w:sz w:val="19"/>
+                <w:sz w:val="18"/>
               </w:rPr>
-              <w:t>齿轮箱</w:t>
+              <w:t>驱动电动机</w:t>
               <w:br/>
-              <w:t>Gear box</w:t>
+              <w:t>Drive motor</w:t>
             </w:r>
           </w:p>
         </w:tc>
         <w:tc>
           <w:tcPr>
-            <w:tcW w:type="dxa" w:w="2835"/>
+            <w:tcW w:type="dxa" w:w="2750"/>
           </w:tcPr>
           <w:p>
             <w:pPr>
-              <w:spacing w:before="40" w:after="60" w:line="252" w:lineRule="auto"/>
+              <w:spacing w:before="40" w:after="60" w:line="247" w:lineRule="auto"/>
             </w:pPr>
             <w:r>
               <w:rPr>
-                <w:sz w:val="19"/>
+                <w:sz w:val="18"/>
               </w:rPr>
-              <w:t>降低驱动电动机转速，并把转矩传递至曳引轮。</w:t>
+              <w:t>提供转动曳引轮的机械动力。</w:t>
             </w:r>
           </w:p>
         </w:tc>
         <w:tc>
           <w:tcPr>
-            <w:tcW w:type="dxa" w:w="4309"/>
+            <w:tcW w:type="dxa" w:w="4337"/>
           </w:tcPr>
           <w:p>
             <w:pPr>
-              <w:spacing w:before="40" w:after="60" w:line="252" w:lineRule="auto"/>
+              <w:spacing w:before="40" w:after="60" w:line="247" w:lineRule="auto"/>
             </w:pPr>
             <w:r>
               <w:rPr>
-                <w:sz w:val="19"/>
+                <w:sz w:val="18"/>
               </w:rPr>
-              <w:t>Reduces drive motor speed and transmits torque to the drive sheave.</w:t>
+              <w:t>Provides mechanical power to rotate the Drive sheave.</w:t>
             </w:r>
           </w:p>
         </w:tc>
@@ -194,51 +194,51 @@
         </w:trPr>
         <w:tc>
           <w:tcPr>
-            <w:tcW w:type="dxa" w:w="3175"/>
+            <w:tcW w:type="dxa" w:w="3288"/>
           </w:tcPr>
           <w:p>
             <w:pPr>
-              <w:spacing w:before="40" w:after="60" w:line="252" w:lineRule="auto"/>
+              <w:spacing w:before="40" w:after="60" w:line="247" w:lineRule="auto"/>
             </w:pPr>
             <w:r>
               <w:rPr>
-                <w:sz w:val="19"/>
+                <w:sz w:val="18"/>
               </w:rPr>
-              <w:t>曳引轮</w:t>
+              <w:t>制动器</w:t>
               <w:br/>
-              <w:t>Drive sheave</w:t>
+              <w:t>Brake</w:t>
             </w:r>
           </w:p>
         </w:tc>
         <w:tc>
           <w:tcPr>
-            <w:tcW w:type="dxa" w:w="2835"/>
+            <w:tcW w:type="dxa" w:w="2750"/>
           </w:tcPr>
           <w:p>
             <w:pPr>
-              <w:spacing w:before="40" w:after="60" w:line="252" w:lineRule="auto"/>
+              <w:spacing w:before="40" w:after="60" w:line="247" w:lineRule="auto"/>
             </w:pPr>
             <w:r>
               <w:rPr>
-                <w:sz w:val="19"/>
+                <w:sz w:val="18"/>
               </w:rPr>
-              <w:t>通过与悬吊绳之间的摩擦传递驱动力。</w:t>
+              <w:t>使驱动系统停止并保持静止；采用弹簧施闸、电力释放的安排。</w:t>
             </w:r>
           </w:p>
         </w:tc>
         <w:tc>
           <w:tcPr>
-            <w:tcW w:type="dxa" w:w="4309"/>
+            <w:tcW w:type="dxa" w:w="4337"/>
           </w:tcPr>
           <w:p>
             <w:pPr>
-              <w:spacing w:before="40" w:after="60" w:line="252" w:lineRule="auto"/>
+              <w:spacing w:before="40" w:after="60" w:line="247" w:lineRule="auto"/>
             </w:pPr>
             <w:r>
               <w:rPr>
-                <w:sz w:val="19"/>
+                <w:sz w:val="18"/>
               </w:rPr>
-              <w:t>Transmits driving force through friction with the suspension rope.</w:t>
+              <w:t>Stops and holds the drive system; it is spring-applied and electrically released.</w:t>
             </w:r>
           </w:p>
         </w:tc>
@@ -249,51 +249,51 @@
         </w:trPr>
         <w:tc>
           <w:tcPr>
-            <w:tcW w:type="dxa" w:w="3175"/>
+            <w:tcW w:type="dxa" w:w="3288"/>
           </w:tcPr>
           <w:p>
             <w:pPr>
-              <w:spacing w:before="40" w:after="60" w:line="252" w:lineRule="auto"/>
+              <w:spacing w:before="40" w:after="60" w:line="247" w:lineRule="auto"/>
             </w:pPr>
             <w:r>
               <w:rPr>
-                <w:sz w:val="19"/>
+                <w:sz w:val="18"/>
               </w:rPr>
-              <w:t>悬吊绳</w:t>
+              <w:t>曳引轮</w:t>
               <w:br/>
-              <w:t>Suspension rope</w:t>
+              <w:t>Drive sheave</w:t>
             </w:r>
           </w:p>
         </w:tc>
         <w:tc>
           <w:tcPr>
-            <w:tcW w:type="dxa" w:w="2835"/>
+            <w:tcW w:type="dxa" w:w="2750"/>
           </w:tcPr>
           <w:p>
             <w:pPr>
-              <w:spacing w:before="40" w:after="60" w:line="252" w:lineRule="auto"/>
+              <w:spacing w:before="40" w:after="60" w:line="247" w:lineRule="auto"/>
             </w:pPr>
             <w:r>
               <w:rPr>
-                <w:sz w:val="19"/>
+                <w:sz w:val="18"/>
               </w:rPr>
-              <w:t>连接并悬吊轿厢和对重，使两者反向移动。</w:t>
+              <w:t>通过与悬吊绳之间的摩擦传递驱动力。</w:t>
             </w:r>
           </w:p>
         </w:tc>
         <w:tc>
           <w:tcPr>
-            <w:tcW w:type="dxa" w:w="4309"/>
+            <w:tcW w:type="dxa" w:w="4337"/>
           </w:tcPr>
           <w:p>
             <w:pPr>
-              <w:spacing w:before="40" w:after="60" w:line="252" w:lineRule="auto"/>
+              <w:spacing w:before="40" w:after="60" w:line="247" w:lineRule="auto"/>
             </w:pPr>
             <w:r>
               <w:rPr>
-                <w:sz w:val="19"/>
+                <w:sz w:val="18"/>
               </w:rPr>
-              <w:t>Connects and suspends the car and counterweight so that they move in opposite directions.</w:t>
+              <w:t>Transmits driving force through friction with the Suspension rope.</w:t>
             </w:r>
           </w:p>
         </w:tc>
@@ -304,15 +304,186 @@
         </w:trPr>
         <w:tc>
           <w:tcPr>
-            <w:tcW w:type="dxa" w:w="3175"/>
+            <w:tcW w:type="dxa" w:w="3288"/>
+            <w:shd w:fill="FFF0F0"/>
           </w:tcPr>
           <w:p>
             <w:pPr>
-              <w:spacing w:before="40" w:after="60" w:line="252" w:lineRule="auto"/>
+              <w:spacing w:before="40" w:after="60" w:line="247" w:lineRule="auto"/>
             </w:pPr>
             <w:r>
               <w:rPr>
-                <w:sz w:val="19"/>
+                <w:b/>
+                <w:color w:val="B71920"/>
+                <w:sz w:val="18"/>
+              </w:rPr>
+              <w:t>悬吊绳</w:t>
+              <w:br/>
+              <w:t>Suspension rope</w:t>
+            </w:r>
+          </w:p>
+        </w:tc>
+        <w:tc>
+          <w:tcPr>
+            <w:tcW w:type="dxa" w:w="2750"/>
+          </w:tcPr>
+          <w:p>
+            <w:pPr>
+              <w:spacing w:before="40" w:after="60" w:line="247" w:lineRule="auto"/>
+            </w:pPr>
+            <w:r>
+              <w:rPr>
+                <w:sz w:val="18"/>
+              </w:rPr>
+              <w:t>悬吊轿厢和对重，使两者沿各自导轨反向移动。</w:t>
+            </w:r>
+          </w:p>
+        </w:tc>
+        <w:tc>
+          <w:tcPr>
+            <w:tcW w:type="dxa" w:w="4337"/>
+          </w:tcPr>
+          <w:p>
+            <w:pPr>
+              <w:spacing w:before="40" w:after="60" w:line="247" w:lineRule="auto"/>
+            </w:pPr>
+            <w:r>
+              <w:rPr>
+                <w:sz w:val="18"/>
+              </w:rPr>
+              <w:t>Suspends the Car and Counterweight and moves them in opposite directions along their respective guide rails.</w:t>
+            </w:r>
+          </w:p>
+        </w:tc>
+      </w:tr>
+      <w:tr>
+        <w:trPr>
+          <w:cantSplit/>
+        </w:trPr>
+        <w:tc>
+          <w:tcPr>
+            <w:tcW w:type="dxa" w:w="3288"/>
+            <w:shd w:fill="FFF0F0"/>
+          </w:tcPr>
+          <w:p>
+            <w:pPr>
+              <w:spacing w:before="40" w:after="60" w:line="247" w:lineRule="auto"/>
+            </w:pPr>
+            <w:r>
+              <w:rPr>
+                <w:b/>
+                <w:color w:val="B71920"/>
+                <w:sz w:val="18"/>
+              </w:rPr>
+              <w:t>限速器</w:t>
+              <w:br/>
+              <w:t>Overspeed governor</w:t>
+            </w:r>
+          </w:p>
+        </w:tc>
+        <w:tc>
+          <w:tcPr>
+            <w:tcW w:type="dxa" w:w="2750"/>
+          </w:tcPr>
+          <w:p>
+            <w:pPr>
+              <w:spacing w:before="40" w:after="60" w:line="247" w:lineRule="auto"/>
+            </w:pPr>
+            <w:r>
+              <w:rPr>
+                <w:sz w:val="18"/>
+              </w:rPr>
+              <w:t>检测运行速度；达到预定超速值时触发安全停止，并在需要时使安全钳动作。</w:t>
+            </w:r>
+          </w:p>
+        </w:tc>
+        <w:tc>
+          <w:tcPr>
+            <w:tcW w:type="dxa" w:w="4337"/>
+          </w:tcPr>
+          <w:p>
+            <w:pPr>
+              <w:spacing w:before="40" w:after="60" w:line="247" w:lineRule="auto"/>
+            </w:pPr>
+            <w:r>
+              <w:rPr>
+                <w:sz w:val="18"/>
+              </w:rPr>
+              <w:t>Monitors speed and initiates safety stopping at a predetermined overspeed, applying the Safety gear when necessary.</w:t>
+            </w:r>
+          </w:p>
+        </w:tc>
+      </w:tr>
+      <w:tr>
+        <w:trPr>
+          <w:cantSplit/>
+        </w:trPr>
+        <w:tc>
+          <w:tcPr>
+            <w:tcW w:type="dxa" w:w="3288"/>
+          </w:tcPr>
+          <w:p>
+            <w:pPr>
+              <w:spacing w:before="40" w:after="60" w:line="247" w:lineRule="auto"/>
+            </w:pPr>
+            <w:r>
+              <w:rPr>
+                <w:sz w:val="18"/>
+              </w:rPr>
+              <w:t>门机</w:t>
+              <w:br/>
+              <w:t>Door operator</w:t>
+            </w:r>
+          </w:p>
+        </w:tc>
+        <w:tc>
+          <w:tcPr>
+            <w:tcW w:type="dxa" w:w="2750"/>
+          </w:tcPr>
+          <w:p>
+            <w:pPr>
+              <w:spacing w:before="40" w:after="60" w:line="247" w:lineRule="auto"/>
+            </w:pPr>
+            <w:r>
+              <w:rPr>
+                <w:sz w:val="18"/>
+              </w:rPr>
+              <w:t>驱动轿门开启和关闭。</w:t>
+            </w:r>
+          </w:p>
+        </w:tc>
+        <w:tc>
+          <w:tcPr>
+            <w:tcW w:type="dxa" w:w="4337"/>
+          </w:tcPr>
+          <w:p>
+            <w:pPr>
+              <w:spacing w:before="40" w:after="60" w:line="247" w:lineRule="auto"/>
+            </w:pPr>
+            <w:r>
+              <w:rPr>
+                <w:sz w:val="18"/>
+              </w:rPr>
+              <w:t>Opens and closes the Car doors.</w:t>
+            </w:r>
+          </w:p>
+        </w:tc>
+      </w:tr>
+      <w:tr>
+        <w:trPr>
+          <w:cantSplit/>
+        </w:trPr>
+        <w:tc>
+          <w:tcPr>
+            <w:tcW w:type="dxa" w:w="3288"/>
+          </w:tcPr>
+          <w:p>
+            <w:pPr>
+              <w:spacing w:before="40" w:after="60" w:line="247" w:lineRule="auto"/>
+            </w:pPr>
+            <w:r>
+              <w:rPr>
+                <w:sz w:val="18"/>
               </w:rPr>
               <w:t>轿厢</w:t>
               <w:br/>
@@ -322,15 +493,15 @@
         </w:tc>
         <w:tc>
           <w:tcPr>
-            <w:tcW w:type="dxa" w:w="2835"/>
+            <w:tcW w:type="dxa" w:w="2750"/>
           </w:tcPr>
           <w:p>
             <w:pPr>
-              <w:spacing w:before="40" w:after="60" w:line="252" w:lineRule="auto"/>
+              <w:spacing w:before="40" w:after="60" w:line="247" w:lineRule="auto"/>
             </w:pPr>
             <w:r>
               <w:rPr>
-                <w:sz w:val="19"/>
+                <w:sz w:val="18"/>
               </w:rPr>
               <w:t>承载乘客或货物。</w:t>
             </w:r>
@@ -338,15 +509,15 @@
         </w:tc>
         <w:tc>
           <w:tcPr>
-            <w:tcW w:type="dxa" w:w="4309"/>
+            <w:tcW w:type="dxa" w:w="4337"/>
           </w:tcPr>
           <w:p>
             <w:pPr>
-              <w:spacing w:before="40" w:after="60" w:line="252" w:lineRule="auto"/>
+              <w:spacing w:before="40" w:after="60" w:line="247" w:lineRule="auto"/>
             </w:pPr>
             <w:r>
               <w:rPr>
-                <w:sz w:val="19"/>
+                <w:sz w:val="18"/>
               </w:rPr>
               <w:t>Carries passengers or goods.</w:t>
             </w:r>
@@ -359,51 +530,51 @@
         </w:trPr>
         <w:tc>
           <w:tcPr>
-            <w:tcW w:type="dxa" w:w="3175"/>
+            <w:tcW w:type="dxa" w:w="3288"/>
           </w:tcPr>
           <w:p>
             <w:pPr>
-              <w:spacing w:before="40" w:after="60" w:line="252" w:lineRule="auto"/>
+              <w:spacing w:before="40" w:after="60" w:line="247" w:lineRule="auto"/>
             </w:pPr>
             <w:r>
               <w:rPr>
-                <w:sz w:val="19"/>
+                <w:sz w:val="18"/>
               </w:rPr>
-              <w:t>对重</w:t>
+              <w:t>轿门</w:t>
               <w:br/>
-              <w:t>Counterweight</w:t>
+              <w:t>Car doors</w:t>
             </w:r>
           </w:p>
         </w:tc>
         <w:tc>
           <w:tcPr>
-            <w:tcW w:type="dxa" w:w="2835"/>
+            <w:tcW w:type="dxa" w:w="2750"/>
           </w:tcPr>
           <w:p>
             <w:pPr>
-              <w:spacing w:before="40" w:after="60" w:line="252" w:lineRule="auto"/>
+              <w:spacing w:before="40" w:after="60" w:line="247" w:lineRule="auto"/>
             </w:pPr>
             <w:r>
               <w:rPr>
-                <w:sz w:val="19"/>
+                <w:sz w:val="18"/>
               </w:rPr>
-              <w:t>平衡轿厢及部分载荷重量，减少驱动电动机需要克服的不平衡负载。</w:t>
+              <w:t>关闭轿厢入口；正常运行时保持关闭。</w:t>
             </w:r>
           </w:p>
         </w:tc>
         <w:tc>
           <w:tcPr>
-            <w:tcW w:type="dxa" w:w="4309"/>
+            <w:tcW w:type="dxa" w:w="4337"/>
           </w:tcPr>
           <w:p>
             <w:pPr>
-              <w:spacing w:before="40" w:after="60" w:line="252" w:lineRule="auto"/>
+              <w:spacing w:before="40" w:after="60" w:line="247" w:lineRule="auto"/>
             </w:pPr>
             <w:r>
               <w:rPr>
-                <w:sz w:val="19"/>
+                <w:sz w:val="18"/>
               </w:rPr>
-              <w:t>Balances the car and part of its load, reducing the unbalanced load that the drive motor must overcome.</w:t>
+              <w:t>Close the Car entrance and remain closed during normal travel.</w:t>
             </w:r>
           </w:p>
         </w:tc>
@@ -414,51 +585,51 @@
         </w:trPr>
         <w:tc>
           <w:tcPr>
-            <w:tcW w:type="dxa" w:w="3175"/>
+            <w:tcW w:type="dxa" w:w="3288"/>
           </w:tcPr>
           <w:p>
             <w:pPr>
-              <w:spacing w:before="40" w:after="60" w:line="252" w:lineRule="auto"/>
+              <w:spacing w:before="40" w:after="60" w:line="247" w:lineRule="auto"/>
             </w:pPr>
             <w:r>
               <w:rPr>
-                <w:sz w:val="19"/>
+                <w:sz w:val="18"/>
               </w:rPr>
-              <w:t>轿厢导轨</w:t>
+              <w:t>护脚板</w:t>
               <w:br/>
-              <w:t>Car guide rail</w:t>
+              <w:t>Apron</w:t>
             </w:r>
           </w:p>
         </w:tc>
         <w:tc>
           <w:tcPr>
-            <w:tcW w:type="dxa" w:w="2835"/>
+            <w:tcW w:type="dxa" w:w="2750"/>
           </w:tcPr>
           <w:p>
             <w:pPr>
-              <w:spacing w:before="40" w:after="60" w:line="252" w:lineRule="auto"/>
+              <w:spacing w:before="40" w:after="60" w:line="247" w:lineRule="auto"/>
             </w:pPr>
             <w:r>
               <w:rPr>
-                <w:sz w:val="19"/>
+                <w:sz w:val="18"/>
               </w:rPr>
-              <w:t>引导轿厢沿垂直路径运行，并供安全钳作用。</w:t>
+              <w:t>向下遮护轿厢入口下方的间隙，降低人员跌入井道的风险。</w:t>
             </w:r>
           </w:p>
         </w:tc>
         <w:tc>
           <w:tcPr>
-            <w:tcW w:type="dxa" w:w="4309"/>
+            <w:tcW w:type="dxa" w:w="4337"/>
           </w:tcPr>
           <w:p>
             <w:pPr>
-              <w:spacing w:before="40" w:after="60" w:line="252" w:lineRule="auto"/>
+              <w:spacing w:before="40" w:after="60" w:line="247" w:lineRule="auto"/>
             </w:pPr>
             <w:r>
               <w:rPr>
-                <w:sz w:val="19"/>
+                <w:sz w:val="18"/>
               </w:rPr>
-              <w:t>Guides the car vertically and provides the surface on which the safety gear acts.</w:t>
+              <w:t>Extends below the Car entrance to guard the gap beneath it and reduce the risk of falling into the Lift well.</w:t>
             </w:r>
           </w:p>
         </w:tc>
@@ -469,51 +640,51 @@
         </w:trPr>
         <w:tc>
           <w:tcPr>
-            <w:tcW w:type="dxa" w:w="3175"/>
+            <w:tcW w:type="dxa" w:w="3288"/>
           </w:tcPr>
           <w:p>
             <w:pPr>
-              <w:spacing w:before="40" w:after="60" w:line="252" w:lineRule="auto"/>
+              <w:spacing w:before="40" w:after="60" w:line="247" w:lineRule="auto"/>
             </w:pPr>
             <w:r>
               <w:rPr>
-                <w:sz w:val="19"/>
+                <w:sz w:val="18"/>
               </w:rPr>
-              <w:t>对重导轨</w:t>
+              <w:t>层站指示器</w:t>
               <w:br/>
-              <w:t>Counterweight guide rail</w:t>
+              <w:t>Landing indicator</w:t>
             </w:r>
           </w:p>
         </w:tc>
         <w:tc>
           <w:tcPr>
-            <w:tcW w:type="dxa" w:w="2835"/>
+            <w:tcW w:type="dxa" w:w="2750"/>
           </w:tcPr>
           <w:p>
             <w:pPr>
-              <w:spacing w:before="40" w:after="60" w:line="252" w:lineRule="auto"/>
+              <w:spacing w:before="40" w:after="60" w:line="247" w:lineRule="auto"/>
             </w:pPr>
             <w:r>
               <w:rPr>
-                <w:sz w:val="19"/>
+                <w:sz w:val="18"/>
               </w:rPr>
-              <w:t>引导对重沿垂直路径运行。</w:t>
+              <w:t>向候梯乘客显示楼层或运行方向等信息。</w:t>
             </w:r>
           </w:p>
         </w:tc>
         <w:tc>
           <w:tcPr>
-            <w:tcW w:type="dxa" w:w="4309"/>
+            <w:tcW w:type="dxa" w:w="4337"/>
           </w:tcPr>
           <w:p>
             <w:pPr>
-              <w:spacing w:before="40" w:after="60" w:line="252" w:lineRule="auto"/>
+              <w:spacing w:before="40" w:after="60" w:line="247" w:lineRule="auto"/>
             </w:pPr>
             <w:r>
               <w:rPr>
-                <w:sz w:val="19"/>
+                <w:sz w:val="18"/>
               </w:rPr>
-              <w:t>Guides the counterweight vertically.</w:t>
+              <w:t>Displays information such as floor position or direction to waiting passengers.</w:t>
             </w:r>
           </w:p>
         </w:tc>
@@ -524,161 +695,51 @@
         </w:trPr>
         <w:tc>
           <w:tcPr>
-            <w:tcW w:type="dxa" w:w="3175"/>
+            <w:tcW w:type="dxa" w:w="3288"/>
           </w:tcPr>
           <w:p>
             <w:pPr>
-              <w:spacing w:before="40" w:after="60" w:line="252" w:lineRule="auto"/>
+              <w:spacing w:before="40" w:after="60" w:line="247" w:lineRule="auto"/>
             </w:pPr>
             <w:r>
               <w:rPr>
-                <w:sz w:val="19"/>
+                <w:sz w:val="18"/>
               </w:rPr>
-              <w:t>制动器</w:t>
+              <w:t>层站按钮</w:t>
               <w:br/>
-              <w:t>Brake</w:t>
+              <w:t>Landing pushbutton</w:t>
             </w:r>
           </w:p>
         </w:tc>
         <w:tc>
           <w:tcPr>
-            <w:tcW w:type="dxa" w:w="2835"/>
+            <w:tcW w:type="dxa" w:w="2750"/>
           </w:tcPr>
           <w:p>
             <w:pPr>
-              <w:spacing w:before="40" w:after="60" w:line="252" w:lineRule="auto"/>
+              <w:spacing w:before="40" w:after="60" w:line="247" w:lineRule="auto"/>
             </w:pPr>
             <w:r>
               <w:rPr>
-                <w:sz w:val="19"/>
+                <w:sz w:val="18"/>
               </w:rPr>
-              <w:t>停止并保持驱动系统。采用弹簧施闸、电力释放的安排。</w:t>
+              <w:t>向控制器发出召梯指令。</w:t>
             </w:r>
           </w:p>
         </w:tc>
         <w:tc>
           <w:tcPr>
-            <w:tcW w:type="dxa" w:w="4309"/>
+            <w:tcW w:type="dxa" w:w="4337"/>
           </w:tcPr>
           <w:p>
             <w:pPr>
-              <w:spacing w:before="40" w:after="60" w:line="252" w:lineRule="auto"/>
+              <w:spacing w:before="40" w:after="60" w:line="247" w:lineRule="auto"/>
             </w:pPr>
             <w:r>
               <w:rPr>
-                <w:sz w:val="19"/>
+                <w:sz w:val="18"/>
               </w:rPr>
-              <w:t>Stops and holds the drive system. It is spring-applied and electrically released.</w:t>
-            </w:r>
-          </w:p>
-        </w:tc>
-      </w:tr>
-      <w:tr>
-        <w:trPr>
-          <w:cantSplit/>
-        </w:trPr>
-        <w:tc>
-          <w:tcPr>
-            <w:tcW w:type="dxa" w:w="3175"/>
-          </w:tcPr>
-          <w:p>
-            <w:pPr>
-              <w:spacing w:before="40" w:after="60" w:line="252" w:lineRule="auto"/>
-            </w:pPr>
-            <w:r>
-              <w:rPr>
-                <w:sz w:val="19"/>
-              </w:rPr>
-              <w:t>控制器</w:t>
-              <w:br/>
-              <w:t>Controller</w:t>
-            </w:r>
-          </w:p>
-        </w:tc>
-        <w:tc>
-          <w:tcPr>
-            <w:tcW w:type="dxa" w:w="2835"/>
-          </w:tcPr>
-          <w:p>
-            <w:pPr>
-              <w:spacing w:before="40" w:after="60" w:line="252" w:lineRule="auto"/>
-            </w:pPr>
-            <w:r>
-              <w:rPr>
-                <w:sz w:val="19"/>
-              </w:rPr>
-              <w:t>协调运行方向、速度、减速、平层、停车及开关门。</w:t>
-            </w:r>
-          </w:p>
-        </w:tc>
-        <w:tc>
-          <w:tcPr>
-            <w:tcW w:type="dxa" w:w="4309"/>
-          </w:tcPr>
-          <w:p>
-            <w:pPr>
-              <w:spacing w:before="40" w:after="60" w:line="252" w:lineRule="auto"/>
-            </w:pPr>
-            <w:r>
-              <w:rPr>
-                <w:sz w:val="19"/>
-              </w:rPr>
-              <w:t>Coordinates direction, speed, deceleration, levelling, stopping and door operation.</w:t>
-            </w:r>
-          </w:p>
-        </w:tc>
-      </w:tr>
-      <w:tr>
-        <w:trPr>
-          <w:cantSplit/>
-        </w:trPr>
-        <w:tc>
-          <w:tcPr>
-            <w:tcW w:type="dxa" w:w="3175"/>
-          </w:tcPr>
-          <w:p>
-            <w:pPr>
-              <w:spacing w:before="40" w:after="60" w:line="252" w:lineRule="auto"/>
-            </w:pPr>
-            <w:r>
-              <w:rPr>
-                <w:sz w:val="19"/>
-              </w:rPr>
-              <w:t>门机</w:t>
-              <w:br/>
-              <w:t>Door operator</w:t>
-            </w:r>
-          </w:p>
-        </w:tc>
-        <w:tc>
-          <w:tcPr>
-            <w:tcW w:type="dxa" w:w="2835"/>
-          </w:tcPr>
-          <w:p>
-            <w:pPr>
-              <w:spacing w:before="40" w:after="60" w:line="252" w:lineRule="auto"/>
-            </w:pPr>
-            <w:r>
-              <w:rPr>
-                <w:sz w:val="19"/>
-              </w:rPr>
-              <w:t>驱动轿门开启和关闭。</w:t>
-            </w:r>
-          </w:p>
-        </w:tc>
-        <w:tc>
-          <w:tcPr>
-            <w:tcW w:type="dxa" w:w="4309"/>
-          </w:tcPr>
-          <w:p>
-            <w:pPr>
-              <w:spacing w:before="40" w:after="60" w:line="252" w:lineRule="auto"/>
-            </w:pPr>
-            <w:r>
-              <w:rPr>
-                <w:sz w:val="19"/>
-              </w:rPr>
-              <w:t>Opens and closes the car doors.</w:t>
+              <w:t>Registers a landing call with the Controller.</w:t>
             </w:r>
           </w:p>
         </w:tc>
@@ -705,9 +766,9 @@
         <w:tblLook w:firstColumn="1" w:firstRow="1" w:lastColumn="0" w:lastRow="0" w:noHBand="0" w:noVBand="1" w:val="04A0"/>
       </w:tblPr>
       <w:tblGrid>
-        <w:gridCol w:w="3175"/>
-        <w:gridCol w:w="2835"/>
-        <w:gridCol w:w="4309"/>
+        <w:gridCol w:w="3288"/>
+        <w:gridCol w:w="2750"/>
+        <w:gridCol w:w="4337"/>
       </w:tblGrid>
       <w:tr>
         <w:trPr>
@@ -715,19 +776,19 @@
         </w:trPr>
         <w:tc>
           <w:tcPr>
-            <w:tcW w:type="dxa" w:w="3175"/>
-            <w:shd w:fill="E5EDF3"/>
+            <w:tcW w:type="dxa" w:w="3288"/>
+            <w:shd w:fill="E7EDF2"/>
           </w:tcPr>
           <w:p>
             <w:r>
-              <w:t>主要部件 / Major component</w:t>
+              <w:t>部件 / Component</w:t>
             </w:r>
           </w:p>
         </w:tc>
         <w:tc>
           <w:tcPr>
-            <w:tcW w:type="dxa" w:w="2835"/>
-            <w:shd w:fill="E5EDF3"/>
+            <w:tcW w:type="dxa" w:w="2750"/>
+            <w:shd w:fill="E7EDF2"/>
           </w:tcPr>
           <w:p>
             <w:r>
@@ -737,8 +798,8 @@
         </w:tc>
         <w:tc>
           <w:tcPr>
-            <w:tcW w:type="dxa" w:w="4309"/>
-            <w:shd w:fill="E5EDF3"/>
+            <w:tcW w:type="dxa" w:w="4337"/>
+            <w:shd w:fill="E7EDF2"/>
           </w:tcPr>
           <w:p>
             <w:r>
@@ -753,51 +814,51 @@
         </w:trPr>
         <w:tc>
           <w:tcPr>
-            <w:tcW w:type="dxa" w:w="3175"/>
+            <w:tcW w:type="dxa" w:w="3288"/>
           </w:tcPr>
           <w:p>
             <w:pPr>
-              <w:spacing w:before="40" w:after="60" w:line="252" w:lineRule="auto"/>
+              <w:spacing w:before="40" w:after="60" w:line="247" w:lineRule="auto"/>
             </w:pPr>
             <w:r>
               <w:rPr>
-                <w:sz w:val="19"/>
+                <w:sz w:val="18"/>
               </w:rPr>
-              <w:t>轿门</w:t>
+              <w:t>井道</w:t>
               <w:br/>
-              <w:t>Car doors</w:t>
+              <w:t>Lift well</w:t>
             </w:r>
           </w:p>
         </w:tc>
         <w:tc>
           <w:tcPr>
-            <w:tcW w:type="dxa" w:w="2835"/>
+            <w:tcW w:type="dxa" w:w="2750"/>
           </w:tcPr>
           <w:p>
             <w:pPr>
-              <w:spacing w:before="40" w:after="60" w:line="252" w:lineRule="auto"/>
+              <w:spacing w:before="40" w:after="60" w:line="247" w:lineRule="auto"/>
             </w:pPr>
             <w:r>
               <w:rPr>
-                <w:sz w:val="19"/>
+                <w:sz w:val="18"/>
               </w:rPr>
-              <w:t>关闭轿厢入口，保障运行期间的乘客安全。</w:t>
+              <w:t>围护轿厢、对重及相关设备的运行空间。</w:t>
             </w:r>
           </w:p>
         </w:tc>
         <w:tc>
           <w:tcPr>
-            <w:tcW w:type="dxa" w:w="4309"/>
+            <w:tcW w:type="dxa" w:w="4337"/>
           </w:tcPr>
           <w:p>
             <w:pPr>
-              <w:spacing w:before="40" w:after="60" w:line="252" w:lineRule="auto"/>
+              <w:spacing w:before="40" w:after="60" w:line="247" w:lineRule="auto"/>
             </w:pPr>
             <w:r>
               <w:rPr>
-                <w:sz w:val="19"/>
+                <w:sz w:val="18"/>
               </w:rPr>
-              <w:t>Close the car entrance to protect passengers during travel.</w:t>
+              <w:t>Encloses the travel space of the Car, Counterweight and associated equipment.</w:t>
             </w:r>
           </w:p>
         </w:tc>
@@ -808,51 +869,51 @@
         </w:trPr>
         <w:tc>
           <w:tcPr>
-            <w:tcW w:type="dxa" w:w="3175"/>
+            <w:tcW w:type="dxa" w:w="3288"/>
           </w:tcPr>
           <w:p>
             <w:pPr>
-              <w:spacing w:before="40" w:after="60" w:line="252" w:lineRule="auto"/>
+              <w:spacing w:before="40" w:after="60" w:line="247" w:lineRule="auto"/>
             </w:pPr>
             <w:r>
               <w:rPr>
-                <w:sz w:val="19"/>
+                <w:sz w:val="18"/>
               </w:rPr>
-              <w:t>层门</w:t>
+              <w:t>轿厢导轨</w:t>
               <w:br/>
-              <w:t>Landing doors</w:t>
+              <w:t>Car guide rail</w:t>
             </w:r>
           </w:p>
         </w:tc>
         <w:tc>
           <w:tcPr>
-            <w:tcW w:type="dxa" w:w="2835"/>
+            <w:tcW w:type="dxa" w:w="2750"/>
           </w:tcPr>
           <w:p>
             <w:pPr>
-              <w:spacing w:before="40" w:after="60" w:line="252" w:lineRule="auto"/>
+              <w:spacing w:before="40" w:after="60" w:line="247" w:lineRule="auto"/>
             </w:pPr>
             <w:r>
               <w:rPr>
-                <w:sz w:val="19"/>
+                <w:sz w:val="18"/>
               </w:rPr>
-              <w:t>关闭各楼层通向井道的入口。</w:t>
+              <w:t>引导轿厢垂直运行，并供安全钳作用。</w:t>
             </w:r>
           </w:p>
         </w:tc>
         <w:tc>
           <w:tcPr>
-            <w:tcW w:type="dxa" w:w="4309"/>
+            <w:tcW w:type="dxa" w:w="4337"/>
           </w:tcPr>
           <w:p>
             <w:pPr>
-              <w:spacing w:before="40" w:after="60" w:line="252" w:lineRule="auto"/>
+              <w:spacing w:before="40" w:after="60" w:line="247" w:lineRule="auto"/>
             </w:pPr>
             <w:r>
               <w:rPr>
-                <w:sz w:val="19"/>
+                <w:sz w:val="18"/>
               </w:rPr>
-              <w:t>Close the well entrance at each landing.</w:t>
+              <w:t>Guides the Car vertically and provides the surface on which the Safety gear acts.</w:t>
             </w:r>
           </w:p>
         </w:tc>
@@ -863,51 +924,54 @@
         </w:trPr>
         <w:tc>
           <w:tcPr>
-            <w:tcW w:type="dxa" w:w="3175"/>
+            <w:tcW w:type="dxa" w:w="3288"/>
+            <w:shd w:fill="FFF0F0"/>
           </w:tcPr>
           <w:p>
             <w:pPr>
-              <w:spacing w:before="40" w:after="60" w:line="252" w:lineRule="auto"/>
+              <w:spacing w:before="40" w:after="60" w:line="247" w:lineRule="auto"/>
             </w:pPr>
             <w:r>
               <w:rPr>
-                <w:sz w:val="19"/>
+                <w:b/>
+                <w:color w:val="B71920"/>
+                <w:sz w:val="18"/>
               </w:rPr>
-              <w:t>层门联锁</w:t>
+              <w:t>安全钳</w:t>
               <w:br/>
-              <w:t>Landing door interlock</w:t>
+              <w:t>Safety gear</w:t>
             </w:r>
           </w:p>
         </w:tc>
         <w:tc>
           <w:tcPr>
-            <w:tcW w:type="dxa" w:w="2835"/>
+            <w:tcW w:type="dxa" w:w="2750"/>
           </w:tcPr>
           <w:p>
             <w:pPr>
-              <w:spacing w:before="40" w:after="60" w:line="252" w:lineRule="auto"/>
+              <w:spacing w:before="40" w:after="60" w:line="247" w:lineRule="auto"/>
             </w:pPr>
             <w:r>
               <w:rPr>
-                <w:sz w:val="19"/>
+                <w:sz w:val="18"/>
               </w:rPr>
-              <w:t>层门未正确关闭并锁紧时，阻止升降机正常运行。</w:t>
+              <w:t>在向下超速或悬吊失效等情况下，作用于轿厢导轨，使轿厢停止并保持静止。</w:t>
             </w:r>
           </w:p>
         </w:tc>
         <w:tc>
           <w:tcPr>
-            <w:tcW w:type="dxa" w:w="4309"/>
+            <w:tcW w:type="dxa" w:w="4337"/>
           </w:tcPr>
           <w:p>
             <w:pPr>
-              <w:spacing w:before="40" w:after="60" w:line="252" w:lineRule="auto"/>
+              <w:spacing w:before="40" w:after="60" w:line="247" w:lineRule="auto"/>
             </w:pPr>
             <w:r>
               <w:rPr>
-                <w:sz w:val="19"/>
+                <w:sz w:val="18"/>
               </w:rPr>
-              <w:t>Prevents normal travel unless the landing doors are properly closed and locked.</w:t>
+              <w:t>Acts on the Car guide rail to stop and hold the Car during downward overspeed or suspension failure.</w:t>
             </w:r>
           </w:p>
         </w:tc>
@@ -918,51 +982,51 @@
         </w:trPr>
         <w:tc>
           <w:tcPr>
-            <w:tcW w:type="dxa" w:w="3175"/>
+            <w:tcW w:type="dxa" w:w="3288"/>
           </w:tcPr>
           <w:p>
             <w:pPr>
-              <w:spacing w:before="40" w:after="60" w:line="252" w:lineRule="auto"/>
+              <w:spacing w:before="40" w:after="60" w:line="247" w:lineRule="auto"/>
             </w:pPr>
             <w:r>
               <w:rPr>
-                <w:sz w:val="19"/>
+                <w:sz w:val="18"/>
               </w:rPr>
-              <w:t>层门接近传感器</w:t>
+              <w:t>随行电缆</w:t>
               <w:br/>
-              <w:t>Landing door proximity sensor</w:t>
+              <w:t>Travelling cables</w:t>
             </w:r>
           </w:p>
         </w:tc>
         <w:tc>
           <w:tcPr>
-            <w:tcW w:type="dxa" w:w="2835"/>
+            <w:tcW w:type="dxa" w:w="2750"/>
           </w:tcPr>
           <w:p>
             <w:pPr>
-              <w:spacing w:before="40" w:after="60" w:line="252" w:lineRule="auto"/>
+              <w:spacing w:before="40" w:after="60" w:line="247" w:lineRule="auto"/>
             </w:pPr>
             <w:r>
               <w:rPr>
-                <w:sz w:val="19"/>
+                <w:sz w:val="18"/>
               </w:rPr>
-              <w:t>关门期间检测到乘客进入时，使门重新打开。</w:t>
+              <w:t>连接固定设备和移动轿厢，传送电源及控制信号。</w:t>
             </w:r>
           </w:p>
         </w:tc>
         <w:tc>
           <w:tcPr>
-            <w:tcW w:type="dxa" w:w="4309"/>
+            <w:tcW w:type="dxa" w:w="4337"/>
           </w:tcPr>
           <w:p>
             <w:pPr>
-              <w:spacing w:before="40" w:after="60" w:line="252" w:lineRule="auto"/>
+              <w:spacing w:before="40" w:after="60" w:line="247" w:lineRule="auto"/>
             </w:pPr>
             <w:r>
               <w:rPr>
-                <w:sz w:val="19"/>
+                <w:sz w:val="18"/>
               </w:rPr>
-              <w:t>Causes closing doors to reopen when a person enters.</w:t>
+              <w:t>Carry power and control signals between fixed equipment and the moving Car.</w:t>
             </w:r>
           </w:p>
         </w:tc>
@@ -973,51 +1037,51 @@
         </w:trPr>
         <w:tc>
           <w:tcPr>
-            <w:tcW w:type="dxa" w:w="3175"/>
+            <w:tcW w:type="dxa" w:w="3288"/>
           </w:tcPr>
           <w:p>
             <w:pPr>
-              <w:spacing w:before="40" w:after="60" w:line="252" w:lineRule="auto"/>
+              <w:spacing w:before="40" w:after="60" w:line="247" w:lineRule="auto"/>
             </w:pPr>
             <w:r>
               <w:rPr>
-                <w:sz w:val="19"/>
+                <w:sz w:val="18"/>
               </w:rPr>
-              <w:t>限速器</w:t>
+              <w:t>层门</w:t>
               <w:br/>
-              <w:t>Overspeed governor</w:t>
+              <w:t>Landing doors</w:t>
             </w:r>
           </w:p>
         </w:tc>
         <w:tc>
           <w:tcPr>
-            <w:tcW w:type="dxa" w:w="2835"/>
+            <w:tcW w:type="dxa" w:w="2750"/>
           </w:tcPr>
           <w:p>
             <w:pPr>
-              <w:spacing w:before="40" w:after="60" w:line="252" w:lineRule="auto"/>
+              <w:spacing w:before="40" w:after="60" w:line="247" w:lineRule="auto"/>
             </w:pPr>
             <w:r>
               <w:rPr>
-                <w:sz w:val="19"/>
+                <w:sz w:val="18"/>
               </w:rPr>
-              <w:t>达到预定超速值时触发安全停止，并在需要时使安全钳动作。</w:t>
+              <w:t>关闭各楼层的井道入口；其联锁防止门未关闭锁紧时正常运行。</w:t>
             </w:r>
           </w:p>
         </w:tc>
         <w:tc>
           <w:tcPr>
-            <w:tcW w:type="dxa" w:w="4309"/>
+            <w:tcW w:type="dxa" w:w="4337"/>
           </w:tcPr>
           <w:p>
             <w:pPr>
-              <w:spacing w:before="40" w:after="60" w:line="252" w:lineRule="auto"/>
+              <w:spacing w:before="40" w:after="60" w:line="247" w:lineRule="auto"/>
             </w:pPr>
             <w:r>
               <w:rPr>
-                <w:sz w:val="19"/>
+                <w:sz w:val="18"/>
               </w:rPr>
-              <w:t>Initiates safety stopping at a predetermined overspeed and applies the safety gear when necessary.</w:t>
+              <w:t>Close the Lift well entrance at each landing; their interlocks prevent normal travel unless they are closed and locked.</w:t>
             </w:r>
           </w:p>
         </w:tc>
@@ -1028,51 +1092,51 @@
         </w:trPr>
         <w:tc>
           <w:tcPr>
-            <w:tcW w:type="dxa" w:w="3175"/>
+            <w:tcW w:type="dxa" w:w="3288"/>
           </w:tcPr>
           <w:p>
             <w:pPr>
-              <w:spacing w:before="40" w:after="60" w:line="252" w:lineRule="auto"/>
+              <w:spacing w:before="40" w:after="60" w:line="247" w:lineRule="auto"/>
             </w:pPr>
             <w:r>
               <w:rPr>
-                <w:sz w:val="19"/>
+                <w:sz w:val="18"/>
               </w:rPr>
-              <w:t>安全钳</w:t>
+              <w:t>对重导轨</w:t>
               <w:br/>
-              <w:t>Safety gear</w:t>
+              <w:t>Counterweight guide rail</w:t>
             </w:r>
           </w:p>
         </w:tc>
         <w:tc>
           <w:tcPr>
-            <w:tcW w:type="dxa" w:w="2835"/>
+            <w:tcW w:type="dxa" w:w="2750"/>
           </w:tcPr>
           <w:p>
             <w:pPr>
-              <w:spacing w:before="40" w:after="60" w:line="252" w:lineRule="auto"/>
+              <w:spacing w:before="40" w:after="60" w:line="247" w:lineRule="auto"/>
             </w:pPr>
             <w:r>
               <w:rPr>
-                <w:sz w:val="19"/>
+                <w:sz w:val="18"/>
               </w:rPr>
-              <w:t>向下超速或悬吊失效等情况下，作用于轿厢导轨，停止并保持轿厢。</w:t>
+              <w:t>引导对重沿垂直路径运行，限制横向移动。</w:t>
             </w:r>
           </w:p>
         </w:tc>
         <w:tc>
           <w:tcPr>
-            <w:tcW w:type="dxa" w:w="4309"/>
+            <w:tcW w:type="dxa" w:w="4337"/>
           </w:tcPr>
           <w:p>
             <w:pPr>
-              <w:spacing w:before="40" w:after="60" w:line="252" w:lineRule="auto"/>
+              <w:spacing w:before="40" w:after="60" w:line="247" w:lineRule="auto"/>
             </w:pPr>
             <w:r>
               <w:rPr>
-                <w:sz w:val="19"/>
+                <w:sz w:val="18"/>
               </w:rPr>
-              <w:t>Acts on the car guide rail to stop and hold the car during downward overspeed or suspension failure.</w:t>
+              <w:t>Guides the Counterweight vertically and restrains lateral movement.</w:t>
             </w:r>
           </w:p>
         </w:tc>
@@ -1083,51 +1147,54 @@
         </w:trPr>
         <w:tc>
           <w:tcPr>
-            <w:tcW w:type="dxa" w:w="3175"/>
+            <w:tcW w:type="dxa" w:w="3288"/>
+            <w:shd w:fill="FFF0F0"/>
           </w:tcPr>
           <w:p>
             <w:pPr>
-              <w:spacing w:before="40" w:after="60" w:line="252" w:lineRule="auto"/>
+              <w:spacing w:before="40" w:after="60" w:line="247" w:lineRule="auto"/>
             </w:pPr>
             <w:r>
               <w:rPr>
-                <w:sz w:val="19"/>
+                <w:b/>
+                <w:color w:val="B71920"/>
+                <w:sz w:val="18"/>
               </w:rPr>
-              <w:t>限速器张紧轮</w:t>
+              <w:t>对重</w:t>
               <w:br/>
-              <w:t>Governor tension sheave</w:t>
+              <w:t>Counterweight</w:t>
             </w:r>
           </w:p>
         </w:tc>
         <w:tc>
           <w:tcPr>
-            <w:tcW w:type="dxa" w:w="2835"/>
+            <w:tcW w:type="dxa" w:w="2750"/>
           </w:tcPr>
           <w:p>
             <w:pPr>
-              <w:spacing w:before="40" w:after="60" w:line="252" w:lineRule="auto"/>
+              <w:spacing w:before="40" w:after="60" w:line="247" w:lineRule="auto"/>
             </w:pPr>
             <w:r>
               <w:rPr>
-                <w:sz w:val="19"/>
+                <w:sz w:val="18"/>
               </w:rPr>
-              <w:t>使限速器的绳路保持张紧。</w:t>
+              <w:t>平衡轿厢及部分载荷重量，减少驱动电动机需要克服的不平衡负载。</w:t>
             </w:r>
           </w:p>
         </w:tc>
         <w:tc>
           <w:tcPr>
-            <w:tcW w:type="dxa" w:w="4309"/>
+            <w:tcW w:type="dxa" w:w="4337"/>
           </w:tcPr>
           <w:p>
             <w:pPr>
-              <w:spacing w:before="40" w:after="60" w:line="252" w:lineRule="auto"/>
+              <w:spacing w:before="40" w:after="60" w:line="247" w:lineRule="auto"/>
             </w:pPr>
             <w:r>
               <w:rPr>
-                <w:sz w:val="19"/>
+                <w:sz w:val="18"/>
               </w:rPr>
-              <w:t>Maintains tension in the overspeed governor rope loop.</w:t>
+              <w:t>Balances the Car and part of its load, reducing the unbalanced load that the Drive motor must overcome.</w:t>
             </w:r>
           </w:p>
         </w:tc>
@@ -1138,15 +1205,15 @@
         </w:trPr>
         <w:tc>
           <w:tcPr>
-            <w:tcW w:type="dxa" w:w="3175"/>
+            <w:tcW w:type="dxa" w:w="3288"/>
           </w:tcPr>
           <w:p>
             <w:pPr>
-              <w:spacing w:before="40" w:after="60" w:line="252" w:lineRule="auto"/>
+              <w:spacing w:before="40" w:after="60" w:line="247" w:lineRule="auto"/>
             </w:pPr>
             <w:r>
               <w:rPr>
-                <w:sz w:val="19"/>
+                <w:sz w:val="18"/>
               </w:rPr>
               <w:t>限位开关</w:t>
               <w:br/>
@@ -1156,33 +1223,33 @@
         </w:tc>
         <w:tc>
           <w:tcPr>
-            <w:tcW w:type="dxa" w:w="2835"/>
+            <w:tcW w:type="dxa" w:w="2750"/>
           </w:tcPr>
           <w:p>
             <w:pPr>
-              <w:spacing w:before="40" w:after="60" w:line="252" w:lineRule="auto"/>
+              <w:spacing w:before="40" w:after="60" w:line="247" w:lineRule="auto"/>
             </w:pPr>
             <w:r>
               <w:rPr>
-                <w:sz w:val="19"/>
+                <w:sz w:val="18"/>
               </w:rPr>
-              <w:t>在行程端部提供停止保护，防止超过允许行程。</w:t>
+              <w:t>在行程端部触发停止保护，防止轿厢超越允许行程。</w:t>
             </w:r>
           </w:p>
         </w:tc>
         <w:tc>
           <w:tcPr>
-            <w:tcW w:type="dxa" w:w="4309"/>
+            <w:tcW w:type="dxa" w:w="4337"/>
           </w:tcPr>
           <w:p>
             <w:pPr>
-              <w:spacing w:before="40" w:after="60" w:line="252" w:lineRule="auto"/>
+              <w:spacing w:before="40" w:after="60" w:line="247" w:lineRule="auto"/>
             </w:pPr>
             <w:r>
               <w:rPr>
-                <w:sz w:val="19"/>
+                <w:sz w:val="18"/>
               </w:rPr>
-              <w:t>Provide stopping protection at the ends of travel to prevent overtravel.</w:t>
+              <w:t>Initiate stopping protection at the ends of travel to prevent the Car from exceeding the permitted limits.</w:t>
             </w:r>
           </w:p>
         </w:tc>
@@ -1193,15 +1260,18 @@
         </w:trPr>
         <w:tc>
           <w:tcPr>
-            <w:tcW w:type="dxa" w:w="3175"/>
+            <w:tcW w:type="dxa" w:w="3288"/>
+            <w:shd w:fill="FFF0F0"/>
           </w:tcPr>
           <w:p>
             <w:pPr>
-              <w:spacing w:before="40" w:after="60" w:line="252" w:lineRule="auto"/>
+              <w:spacing w:before="40" w:after="60" w:line="247" w:lineRule="auto"/>
             </w:pPr>
             <w:r>
               <w:rPr>
-                <w:sz w:val="19"/>
+                <w:b/>
+                <w:color w:val="B71920"/>
+                <w:sz w:val="18"/>
               </w:rPr>
               <w:t>轿厢缓冲器</w:t>
               <w:br/>
@@ -1211,33 +1281,33 @@
         </w:tc>
         <w:tc>
           <w:tcPr>
-            <w:tcW w:type="dxa" w:w="2835"/>
+            <w:tcW w:type="dxa" w:w="2750"/>
           </w:tcPr>
           <w:p>
             <w:pPr>
-              <w:spacing w:before="40" w:after="60" w:line="252" w:lineRule="auto"/>
+              <w:spacing w:before="40" w:after="60" w:line="247" w:lineRule="auto"/>
             </w:pPr>
             <w:r>
               <w:rPr>
-                <w:sz w:val="19"/>
+                <w:sz w:val="18"/>
               </w:rPr>
-              <w:t>在轿厢底部越程时吸收冲击能量。</w:t>
+              <w:t>安装于底坑，在轿厢底部越程时吸收冲击能量。</w:t>
             </w:r>
           </w:p>
         </w:tc>
         <w:tc>
           <w:tcPr>
-            <w:tcW w:type="dxa" w:w="4309"/>
+            <w:tcW w:type="dxa" w:w="4337"/>
           </w:tcPr>
           <w:p>
             <w:pPr>
-              <w:spacing w:before="40" w:after="60" w:line="252" w:lineRule="auto"/>
+              <w:spacing w:before="40" w:after="60" w:line="247" w:lineRule="auto"/>
             </w:pPr>
             <w:r>
               <w:rPr>
-                <w:sz w:val="19"/>
+                <w:sz w:val="18"/>
               </w:rPr>
-              <w:t>Absorbs impact energy during bottom overtravel of the car.</w:t>
+              <w:t>Absorbs impact energy in the pit during bottom overtravel of the Car.</w:t>
             </w:r>
           </w:p>
         </w:tc>
@@ -1248,15 +1318,15 @@
         </w:trPr>
         <w:tc>
           <w:tcPr>
-            <w:tcW w:type="dxa" w:w="3175"/>
+            <w:tcW w:type="dxa" w:w="3288"/>
           </w:tcPr>
           <w:p>
             <w:pPr>
-              <w:spacing w:before="40" w:after="60" w:line="252" w:lineRule="auto"/>
+              <w:spacing w:before="40" w:after="60" w:line="247" w:lineRule="auto"/>
             </w:pPr>
             <w:r>
               <w:rPr>
-                <w:sz w:val="19"/>
+                <w:sz w:val="18"/>
               </w:rPr>
               <w:t>对重缓冲器</w:t>
               <w:br/>
@@ -1266,33 +1336,33 @@
         </w:tc>
         <w:tc>
           <w:tcPr>
-            <w:tcW w:type="dxa" w:w="2835"/>
+            <w:tcW w:type="dxa" w:w="2750"/>
           </w:tcPr>
           <w:p>
             <w:pPr>
-              <w:spacing w:before="40" w:after="60" w:line="252" w:lineRule="auto"/>
+              <w:spacing w:before="40" w:after="60" w:line="247" w:lineRule="auto"/>
             </w:pPr>
             <w:r>
               <w:rPr>
-                <w:sz w:val="19"/>
+                <w:sz w:val="18"/>
               </w:rPr>
-              <w:t>在对重底部越程时吸收冲击能量。</w:t>
+              <w:t>安装于底坑，在对重底部越程时吸收冲击能量。</w:t>
             </w:r>
           </w:p>
         </w:tc>
         <w:tc>
           <w:tcPr>
-            <w:tcW w:type="dxa" w:w="4309"/>
+            <w:tcW w:type="dxa" w:w="4337"/>
           </w:tcPr>
           <w:p>
             <w:pPr>
-              <w:spacing w:before="40" w:after="60" w:line="252" w:lineRule="auto"/>
+              <w:spacing w:before="40" w:after="60" w:line="247" w:lineRule="auto"/>
             </w:pPr>
             <w:r>
               <w:rPr>
-                <w:sz w:val="19"/>
+                <w:sz w:val="18"/>
               </w:rPr>
-              <w:t>Absorbs impact energy during bottom overtravel of the counterweight.</w:t>
+              <w:t>Absorbs impact energy in the pit during bottom overtravel of the Counterweight.</w:t>
             </w:r>
           </w:p>
         </w:tc>
@@ -1303,51 +1373,51 @@
         </w:trPr>
         <w:tc>
           <w:tcPr>
-            <w:tcW w:type="dxa" w:w="3175"/>
+            <w:tcW w:type="dxa" w:w="3288"/>
           </w:tcPr>
           <w:p>
             <w:pPr>
-              <w:spacing w:before="40" w:after="60" w:line="252" w:lineRule="auto"/>
+              <w:spacing w:before="40" w:after="60" w:line="247" w:lineRule="auto"/>
             </w:pPr>
             <w:r>
               <w:rPr>
-                <w:sz w:val="19"/>
+                <w:sz w:val="18"/>
               </w:rPr>
-              <w:t>随行电缆</w:t>
+              <w:t>限速器张紧轮</w:t>
               <w:br/>
-              <w:t>Travelling cables</w:t>
+              <w:t>Governor tension sheave</w:t>
             </w:r>
           </w:p>
         </w:tc>
         <w:tc>
           <w:tcPr>
-            <w:tcW w:type="dxa" w:w="2835"/>
+            <w:tcW w:type="dxa" w:w="2750"/>
           </w:tcPr>
           <w:p>
             <w:pPr>
-              <w:spacing w:before="40" w:after="60" w:line="252" w:lineRule="auto"/>
+              <w:spacing w:before="40" w:after="60" w:line="247" w:lineRule="auto"/>
             </w:pPr>
             <w:r>
               <w:rPr>
-                <w:sz w:val="19"/>
+                <w:sz w:val="18"/>
               </w:rPr>
-              <w:t>在固定设备与移动轿厢之间传送电源及控制信号。</w:t>
+              <w:t>位于限速器绳路下部，保持绳路张紧，以维持限速器与轿厢运动的联系。</w:t>
             </w:r>
           </w:p>
         </w:tc>
         <w:tc>
           <w:tcPr>
-            <w:tcW w:type="dxa" w:w="4309"/>
+            <w:tcW w:type="dxa" w:w="4337"/>
           </w:tcPr>
           <w:p>
             <w:pPr>
-              <w:spacing w:before="40" w:after="60" w:line="252" w:lineRule="auto"/>
+              <w:spacing w:before="40" w:after="60" w:line="247" w:lineRule="auto"/>
             </w:pPr>
             <w:r>
               <w:rPr>
-                <w:sz w:val="19"/>
+                <w:sz w:val="18"/>
               </w:rPr>
-              <w:t>Carry power and control signals between fixed equipment and the moving car.</w:t>
+              <w:t>Maintains tension in the lower part of the governor rope loop so that the Overspeed governor remains linked to Car movement.</w:t>
             </w:r>
           </w:p>
         </w:tc>
@@ -1363,25 +1433,18 @@
     </w:p>
     <w:p>
       <w:r>
-        <w:t>层门关闭并锁紧后，控制器协调制动器释放和驱动电动机运行。驱动电动机经齿轮箱带动曳引轮，悬吊绳使轿厢与对重反向移动。接近目标楼层时减速和平层，停车后由制动器保持静止，再开门。限速器和安全钳共同提供超速及悬吊失效情况下的安全保护。</w:t>
+        <w:t>乘客按下层站按钮后，控制器登记召梯。层门关闭并锁紧且安全条件满足后，控制器协调制动器释放和驱动电动机运行，带动曳引轮和悬吊绳，使轿厢移动。接近目标楼层时减速和平层，停车后制动器保持静止，再打开轿门和层门。限速器在达到预定超速值时触发安全停止，并在需要时使安全钳作用于轿厢导轨。</w:t>
       </w:r>
     </w:p>
     <w:p>
       <w:r>
-        <w:t>Once the landing doors are closed and locked, the controller coordinates brake release and drive motor operation. The drive motor turns the drive sheave through the gear box, and the suspension rope moves the car and counterweight in opposite directions. The car slows and levels at the destination, the brake holds it stationary, and the doors open. The overspeed governor and safety gear provide protection during overspeed or suspension failure.</w:t>
+        <w:t>The Landing pushbutton registers a call with the Controller. Once the Landing doors are closed and locked and safety conditions are satisfied, the Controller coordinates Brake release and Drive motor operation. The Drive sheave moves the Suspension rope and Car. The Car slows and levels at the destination; the Brake holds it stationary before the doors open. At a predetermined overspeed, the Overspeed governor initiates safety stopping and applies the Safety gear to the Car guide rail when necessary.</w:t>
       </w:r>
     </w:p>
     <w:p>
-      <w:pPr>
-        <w:sectPr>
-          <w:headerReference w:type="default" r:id="rId9"/>
-          <w:footerReference w:type="default" r:id="rId10"/>
-          <w:pgSz w:w="11906" w:h="16838"/>
-          <w:pgMar w:top="794" w:right="794" w:bottom="794" w:left="794" w:header="340" w:footer="340" w:gutter="0"/>
-          <w:cols w:space="720"/>
-          <w:docGrid w:linePitch="360"/>
-        </w:sectPr>
-      </w:pPr>
+      <w:r>
+        <w:br w:type="page"/>
+      </w:r>
     </w:p>
     <w:p>
       <w:pPr>
@@ -1391,7 +1454,7 @@
       <w:r>
         <w:drawing>
           <wp:inline xmlns:a="http://schemas.openxmlformats.org/drawingml/2006/main" xmlns:pic="http://schemas.openxmlformats.org/drawingml/2006/picture">
-            <wp:extent cx="9540000" cy="6748658"/>
+            <wp:extent cx="6588000" cy="9312788"/>
             <wp:docPr id="1" name="Picture 1"/>
             <wp:cNvGraphicFramePr>
               <a:graphicFrameLocks noChangeAspect="1"/>
@@ -1400,7 +1463,7 @@
               <a:graphicData uri="http://schemas.openxmlformats.org/drawingml/2006/picture">
                 <pic:pic>
                   <pic:nvPicPr>
-                    <pic:cNvPr id="0" name="PIA5704_Q1_Traction_Clear.png"/>
+                    <pic:cNvPr id="0" name="PIA5704_Q1_Traction_PPT_Matched.png"/>
                     <pic:cNvPicPr/>
                   </pic:nvPicPr>
                   <pic:blipFill>
@@ -1412,7 +1475,7 @@
                   <pic:spPr>
                     <a:xfrm>
                       <a:off x="0" y="0"/>
-                      <a:ext cx="9540000" cy="6748658"/>
+                      <a:ext cx="6588000" cy="9312788"/>
                     </a:xfrm>
                     <a:prstGeom prst="rect"/>
                   </pic:spPr>
@@ -1424,14 +1487,9 @@
       </w:r>
     </w:p>
     <w:p>
-      <w:pPr>
-        <w:sectPr>
-          <w:pgSz w:w="16838" w:h="11906" w:orient="landscape"/>
-          <w:pgMar w:top="794" w:right="794" w:bottom="794" w:left="794" w:header="340" w:footer="340" w:gutter="0"/>
-          <w:cols w:space="720"/>
-          <w:docGrid w:linePitch="360"/>
-        </w:sectPr>
-      </w:pPr>
+      <w:r>
+        <w:br w:type="page"/>
+      </w:r>
     </w:p>
     <w:p>
       <w:pPr>
@@ -1443,12 +1501,12 @@
     </w:p>
     <w:p>
       <w:r>
-        <w:t>直顶式液压升降机利用电动机驱动油泵，把液压油由油箱送入油缸。油压使柱塞伸出，直接顶升轿厢。下降时，阀组让油受控流回油箱，轿厢重量使柱塞缩回。此结构的柱塞直接承托轿厢。</w:t>
+        <w:t>直顶式液压升降机由电动机驱动油泵，将液压油由油箱经阀组送入埋地油缸。油压推动柱塞伸出，直接顶升轿厢。下降时，阀组让油受控流回油箱，轿厢重量使柱塞回缩。埋地油缸向地下延伸，以容纳所需行程。</w:t>
       </w:r>
     </w:p>
     <w:p>
       <w:r>
-        <w:t>A direct-driven cylinder hydraulic lift uses a motor-driven pump to deliver oil from the tank into the cylinder. Oil pressure extends the plunger, directly raising the car. During descent, the valve block permits controlled oil return to the tank, and the weight of the car retracts the plunger. The plunger directly supports the car in this arrangement.</w:t>
+        <w:t>A direct-driven cylinder hydraulic lift uses an electrically driven Pump to deliver oil from the Tank through the Valve block into the Cylinder in borehole. Oil pressure extends the Piston and directly raises the Car. During descent, the Valve block permits controlled oil return to the Tank, and the weight of the Car retracts the Piston. The Cylinder in borehole extends below ground to accommodate the required travel.</w:t>
       </w:r>
     </w:p>
     <w:tbl>
@@ -1459,9 +1517,9 @@
         <w:tblLook w:firstColumn="1" w:firstRow="1" w:lastColumn="0" w:lastRow="0" w:noHBand="0" w:noVBand="1" w:val="04A0"/>
       </w:tblPr>
       <w:tblGrid>
-        <w:gridCol w:w="3175"/>
-        <w:gridCol w:w="2835"/>
-        <w:gridCol w:w="4309"/>
+        <w:gridCol w:w="3288"/>
+        <w:gridCol w:w="2750"/>
+        <w:gridCol w:w="4337"/>
       </w:tblGrid>
       <w:tr>
         <w:trPr>
@@ -1469,19 +1527,19 @@
         </w:trPr>
         <w:tc>
           <w:tcPr>
-            <w:tcW w:type="dxa" w:w="3175"/>
-            <w:shd w:fill="E5EDF3"/>
+            <w:tcW w:type="dxa" w:w="3288"/>
+            <w:shd w:fill="E7EDF2"/>
           </w:tcPr>
           <w:p>
             <w:r>
-              <w:t>主要部件 / Major component</w:t>
+              <w:t>部件 / Component</w:t>
             </w:r>
           </w:p>
         </w:tc>
         <w:tc>
           <w:tcPr>
-            <w:tcW w:type="dxa" w:w="2835"/>
-            <w:shd w:fill="E5EDF3"/>
+            <w:tcW w:type="dxa" w:w="2750"/>
+            <w:shd w:fill="E7EDF2"/>
           </w:tcPr>
           <w:p>
             <w:r>
@@ -1491,8 +1549,8 @@
         </w:tc>
         <w:tc>
           <w:tcPr>
-            <w:tcW w:type="dxa" w:w="4309"/>
-            <w:shd w:fill="E5EDF3"/>
+            <w:tcW w:type="dxa" w:w="4337"/>
+            <w:shd w:fill="E7EDF2"/>
           </w:tcPr>
           <w:p>
             <w:r>
@@ -1507,51 +1565,51 @@
         </w:trPr>
         <w:tc>
           <w:tcPr>
-            <w:tcW w:type="dxa" w:w="3175"/>
+            <w:tcW w:type="dxa" w:w="3288"/>
           </w:tcPr>
           <w:p>
             <w:pPr>
-              <w:spacing w:before="40" w:after="60" w:line="252" w:lineRule="auto"/>
+              <w:spacing w:before="40" w:after="60" w:line="247" w:lineRule="auto"/>
             </w:pPr>
             <w:r>
               <w:rPr>
-                <w:sz w:val="19"/>
+                <w:sz w:val="18"/>
               </w:rPr>
-              <w:t>轿厢</w:t>
+              <w:t>轿厢导轨</w:t>
               <w:br/>
-              <w:t>Car</w:t>
+              <w:t>Car guide rails</w:t>
             </w:r>
           </w:p>
         </w:tc>
         <w:tc>
           <w:tcPr>
-            <w:tcW w:type="dxa" w:w="2835"/>
+            <w:tcW w:type="dxa" w:w="2750"/>
           </w:tcPr>
           <w:p>
             <w:pPr>
-              <w:spacing w:before="40" w:after="60" w:line="252" w:lineRule="auto"/>
+              <w:spacing w:before="40" w:after="60" w:line="247" w:lineRule="auto"/>
             </w:pPr>
             <w:r>
               <w:rPr>
-                <w:sz w:val="19"/>
+                <w:sz w:val="18"/>
               </w:rPr>
-              <w:t>承载乘客或货物，并由柱塞直接承托。</w:t>
+              <w:t>引导轿厢垂直运行，并限制横向移动。</w:t>
             </w:r>
           </w:p>
         </w:tc>
         <w:tc>
           <w:tcPr>
-            <w:tcW w:type="dxa" w:w="4309"/>
+            <w:tcW w:type="dxa" w:w="4337"/>
           </w:tcPr>
           <w:p>
             <w:pPr>
-              <w:spacing w:before="40" w:after="60" w:line="252" w:lineRule="auto"/>
+              <w:spacing w:before="40" w:after="60" w:line="247" w:lineRule="auto"/>
             </w:pPr>
             <w:r>
               <w:rPr>
-                <w:sz w:val="19"/>
+                <w:sz w:val="18"/>
               </w:rPr>
-              <w:t>Carries passengers or goods and is directly supported by the plunger.</w:t>
+              <w:t>Guide the Car vertically and restrain lateral movement.</w:t>
             </w:r>
           </w:p>
         </w:tc>
@@ -1562,51 +1620,51 @@
         </w:trPr>
         <w:tc>
           <w:tcPr>
-            <w:tcW w:type="dxa" w:w="3175"/>
+            <w:tcW w:type="dxa" w:w="3288"/>
           </w:tcPr>
           <w:p>
             <w:pPr>
-              <w:spacing w:before="40" w:after="60" w:line="252" w:lineRule="auto"/>
+              <w:spacing w:before="40" w:after="60" w:line="247" w:lineRule="auto"/>
             </w:pPr>
             <w:r>
               <w:rPr>
-                <w:sz w:val="19"/>
+                <w:sz w:val="18"/>
               </w:rPr>
-              <w:t>柱塞</w:t>
+              <w:t>轿厢</w:t>
               <w:br/>
-              <w:t>Plunger</w:t>
+              <w:t>Car</w:t>
             </w:r>
           </w:p>
         </w:tc>
         <w:tc>
           <w:tcPr>
-            <w:tcW w:type="dxa" w:w="2835"/>
+            <w:tcW w:type="dxa" w:w="2750"/>
           </w:tcPr>
           <w:p>
             <w:pPr>
-              <w:spacing w:before="40" w:after="60" w:line="252" w:lineRule="auto"/>
+              <w:spacing w:before="40" w:after="60" w:line="247" w:lineRule="auto"/>
             </w:pPr>
             <w:r>
               <w:rPr>
-                <w:sz w:val="19"/>
+                <w:sz w:val="18"/>
               </w:rPr>
-              <w:t>在油压作用下伸出，直接顶升轿厢；回缩时轿厢下降。</w:t>
+              <w:t>承载乘客或货物，并由柱塞直接承托。</w:t>
             </w:r>
           </w:p>
         </w:tc>
         <w:tc>
           <w:tcPr>
-            <w:tcW w:type="dxa" w:w="4309"/>
+            <w:tcW w:type="dxa" w:w="4337"/>
           </w:tcPr>
           <w:p>
             <w:pPr>
-              <w:spacing w:before="40" w:after="60" w:line="252" w:lineRule="auto"/>
+              <w:spacing w:before="40" w:after="60" w:line="247" w:lineRule="auto"/>
             </w:pPr>
             <w:r>
               <w:rPr>
-                <w:sz w:val="19"/>
+                <w:sz w:val="18"/>
               </w:rPr>
-              <w:t>Extends under oil pressure to raise the car directly; its retraction allows descent.</w:t>
+              <w:t>Carries passengers or goods and is directly supported by the Piston.</w:t>
             </w:r>
           </w:p>
         </w:tc>
@@ -1617,51 +1675,51 @@
         </w:trPr>
         <w:tc>
           <w:tcPr>
-            <w:tcW w:type="dxa" w:w="3175"/>
+            <w:tcW w:type="dxa" w:w="3288"/>
           </w:tcPr>
           <w:p>
             <w:pPr>
-              <w:spacing w:before="40" w:after="60" w:line="252" w:lineRule="auto"/>
+              <w:spacing w:before="40" w:after="60" w:line="247" w:lineRule="auto"/>
             </w:pPr>
             <w:r>
               <w:rPr>
-                <w:sz w:val="19"/>
+                <w:sz w:val="18"/>
               </w:rPr>
-              <w:t>油缸</w:t>
+              <w:t>井道</w:t>
               <w:br/>
-              <w:t>Cylinder</w:t>
+              <w:t>Lift well</w:t>
             </w:r>
           </w:p>
         </w:tc>
         <w:tc>
           <w:tcPr>
-            <w:tcW w:type="dxa" w:w="2835"/>
+            <w:tcW w:type="dxa" w:w="2750"/>
           </w:tcPr>
           <w:p>
             <w:pPr>
-              <w:spacing w:before="40" w:after="60" w:line="252" w:lineRule="auto"/>
+              <w:spacing w:before="40" w:after="60" w:line="247" w:lineRule="auto"/>
             </w:pPr>
             <w:r>
               <w:rPr>
-                <w:sz w:val="19"/>
+                <w:sz w:val="18"/>
               </w:rPr>
-              <w:t>容纳受压液压油，与柱塞共同形成顶升机构。</w:t>
+              <w:t>围护轿厢及相关设备的运行空间。</w:t>
             </w:r>
           </w:p>
         </w:tc>
         <w:tc>
           <w:tcPr>
-            <w:tcW w:type="dxa" w:w="4309"/>
+            <w:tcW w:type="dxa" w:w="4337"/>
           </w:tcPr>
           <w:p>
             <w:pPr>
-              <w:spacing w:before="40" w:after="60" w:line="252" w:lineRule="auto"/>
+              <w:spacing w:before="40" w:after="60" w:line="247" w:lineRule="auto"/>
             </w:pPr>
             <w:r>
               <w:rPr>
-                <w:sz w:val="19"/>
+                <w:sz w:val="18"/>
               </w:rPr>
-              <w:t>Contains pressurised oil and forms the lifting actuator with the plunger.</w:t>
+              <w:t>Encloses the travel space of the Car and associated equipment.</w:t>
             </w:r>
           </w:p>
         </w:tc>
@@ -1672,51 +1730,51 @@
         </w:trPr>
         <w:tc>
           <w:tcPr>
-            <w:tcW w:type="dxa" w:w="3175"/>
+            <w:tcW w:type="dxa" w:w="3288"/>
           </w:tcPr>
           <w:p>
             <w:pPr>
-              <w:spacing w:before="40" w:after="60" w:line="252" w:lineRule="auto"/>
+              <w:spacing w:before="40" w:after="60" w:line="247" w:lineRule="auto"/>
             </w:pPr>
             <w:r>
               <w:rPr>
-                <w:sz w:val="19"/>
+                <w:sz w:val="18"/>
               </w:rPr>
-              <w:t>油箱</w:t>
+              <w:t>控制器</w:t>
               <w:br/>
-              <w:t>Tank</w:t>
+              <w:t>Controller</w:t>
             </w:r>
           </w:p>
         </w:tc>
         <w:tc>
           <w:tcPr>
-            <w:tcW w:type="dxa" w:w="2835"/>
+            <w:tcW w:type="dxa" w:w="2750"/>
           </w:tcPr>
           <w:p>
             <w:pPr>
-              <w:spacing w:before="40" w:after="60" w:line="252" w:lineRule="auto"/>
+              <w:spacing w:before="40" w:after="60" w:line="247" w:lineRule="auto"/>
             </w:pPr>
             <w:r>
               <w:rPr>
-                <w:sz w:val="19"/>
+                <w:sz w:val="18"/>
               </w:rPr>
-              <w:t>储存液压油，向油泵供油并接收下降回油。</w:t>
+              <w:t>接收层站按钮指令，协调油泵、阀组、停车、平层和门机。</w:t>
             </w:r>
           </w:p>
         </w:tc>
         <w:tc>
           <w:tcPr>
-            <w:tcW w:type="dxa" w:w="4309"/>
+            <w:tcW w:type="dxa" w:w="4337"/>
           </w:tcPr>
           <w:p>
             <w:pPr>
-              <w:spacing w:before="40" w:after="60" w:line="252" w:lineRule="auto"/>
+              <w:spacing w:before="40" w:after="60" w:line="247" w:lineRule="auto"/>
             </w:pPr>
             <w:r>
               <w:rPr>
-                <w:sz w:val="19"/>
+                <w:sz w:val="18"/>
               </w:rPr>
-              <w:t>Stores oil, supplies the pump and receives returning oil during descent.</w:t>
+              <w:t>Receives calls from the Landing pushbutton and coordinates the Pump, Valve block, stopping, levelling and Door operator.</w:t>
             </w:r>
           </w:p>
         </w:tc>
@@ -1727,51 +1785,51 @@
         </w:trPr>
         <w:tc>
           <w:tcPr>
-            <w:tcW w:type="dxa" w:w="3175"/>
+            <w:tcW w:type="dxa" w:w="3288"/>
           </w:tcPr>
           <w:p>
             <w:pPr>
-              <w:spacing w:before="40" w:after="60" w:line="252" w:lineRule="auto"/>
+              <w:spacing w:before="40" w:after="60" w:line="247" w:lineRule="auto"/>
             </w:pPr>
             <w:r>
               <w:rPr>
-                <w:sz w:val="19"/>
+                <w:sz w:val="18"/>
               </w:rPr>
-              <w:t>油位计</w:t>
+              <w:t>柱塞</w:t>
               <w:br/>
-              <w:t>Oil level gauge</w:t>
+              <w:t>Piston</w:t>
             </w:r>
           </w:p>
         </w:tc>
         <w:tc>
           <w:tcPr>
-            <w:tcW w:type="dxa" w:w="2835"/>
+            <w:tcW w:type="dxa" w:w="2750"/>
           </w:tcPr>
           <w:p>
             <w:pPr>
-              <w:spacing w:before="40" w:after="60" w:line="252" w:lineRule="auto"/>
+              <w:spacing w:before="40" w:after="60" w:line="247" w:lineRule="auto"/>
             </w:pPr>
             <w:r>
               <w:rPr>
-                <w:sz w:val="19"/>
+                <w:sz w:val="18"/>
               </w:rPr>
-              <w:t>显示油箱中的油位。</w:t>
+              <w:t>在油压作用下伸出，直接顶升轿厢；回缩时轿厢下降。</w:t>
             </w:r>
           </w:p>
         </w:tc>
         <w:tc>
           <w:tcPr>
-            <w:tcW w:type="dxa" w:w="4309"/>
+            <w:tcW w:type="dxa" w:w="4337"/>
           </w:tcPr>
           <w:p>
             <w:pPr>
-              <w:spacing w:before="40" w:after="60" w:line="252" w:lineRule="auto"/>
+              <w:spacing w:before="40" w:after="60" w:line="247" w:lineRule="auto"/>
             </w:pPr>
             <w:r>
               <w:rPr>
-                <w:sz w:val="19"/>
+                <w:sz w:val="18"/>
               </w:rPr>
-              <w:t>Indicates the oil level in the tank.</w:t>
+              <w:t>Extends under oil pressure to raise the Car directly; its retraction allows the Car to descend.</w:t>
             </w:r>
           </w:p>
         </w:tc>
@@ -1782,125 +1840,15 @@
         </w:trPr>
         <w:tc>
           <w:tcPr>
-            <w:tcW w:type="dxa" w:w="3175"/>
+            <w:tcW w:type="dxa" w:w="3288"/>
           </w:tcPr>
           <w:p>
             <w:pPr>
-              <w:spacing w:before="40" w:after="60" w:line="252" w:lineRule="auto"/>
+              <w:spacing w:before="40" w:after="60" w:line="247" w:lineRule="auto"/>
             </w:pPr>
             <w:r>
               <w:rPr>
-                <w:sz w:val="19"/>
-              </w:rPr>
-              <w:t>电动机</w:t>
-              <w:br/>
-              <w:t>Motor</w:t>
-            </w:r>
-          </w:p>
-        </w:tc>
-        <w:tc>
-          <w:tcPr>
-            <w:tcW w:type="dxa" w:w="2835"/>
-          </w:tcPr>
-          <w:p>
-            <w:pPr>
-              <w:spacing w:before="40" w:after="60" w:line="252" w:lineRule="auto"/>
-            </w:pPr>
-            <w:r>
-              <w:rPr>
-                <w:sz w:val="19"/>
-              </w:rPr>
-              <w:t>通过机械轴驱动油泵。</w:t>
-            </w:r>
-          </w:p>
-        </w:tc>
-        <w:tc>
-          <w:tcPr>
-            <w:tcW w:type="dxa" w:w="4309"/>
-          </w:tcPr>
-          <w:p>
-            <w:pPr>
-              <w:spacing w:before="40" w:after="60" w:line="252" w:lineRule="auto"/>
-            </w:pPr>
-            <w:r>
-              <w:rPr>
-                <w:sz w:val="19"/>
-              </w:rPr>
-              <w:t>Drives the pump through a mechanical shaft.</w:t>
-            </w:r>
-          </w:p>
-        </w:tc>
-      </w:tr>
-      <w:tr>
-        <w:trPr>
-          <w:cantSplit/>
-        </w:trPr>
-        <w:tc>
-          <w:tcPr>
-            <w:tcW w:type="dxa" w:w="3175"/>
-          </w:tcPr>
-          <w:p>
-            <w:pPr>
-              <w:spacing w:before="40" w:after="60" w:line="252" w:lineRule="auto"/>
-            </w:pPr>
-            <w:r>
-              <w:rPr>
-                <w:sz w:val="19"/>
-              </w:rPr>
-              <w:t>油泵</w:t>
-              <w:br/>
-              <w:t>Pump</w:t>
-            </w:r>
-          </w:p>
-        </w:tc>
-        <w:tc>
-          <w:tcPr>
-            <w:tcW w:type="dxa" w:w="2835"/>
-          </w:tcPr>
-          <w:p>
-            <w:pPr>
-              <w:spacing w:before="40" w:after="60" w:line="252" w:lineRule="auto"/>
-            </w:pPr>
-            <w:r>
-              <w:rPr>
-                <w:sz w:val="19"/>
-              </w:rPr>
-              <w:t>将油箱内的油送往油缸，提供顶升所需油流。</w:t>
-            </w:r>
-          </w:p>
-        </w:tc>
-        <w:tc>
-          <w:tcPr>
-            <w:tcW w:type="dxa" w:w="4309"/>
-          </w:tcPr>
-          <w:p>
-            <w:pPr>
-              <w:spacing w:before="40" w:after="60" w:line="252" w:lineRule="auto"/>
-            </w:pPr>
-            <w:r>
-              <w:rPr>
-                <w:sz w:val="19"/>
-              </w:rPr>
-              <w:t>Delivers oil from the tank towards the cylinder to raise the car.</w:t>
-            </w:r>
-          </w:p>
-        </w:tc>
-      </w:tr>
-      <w:tr>
-        <w:trPr>
-          <w:cantSplit/>
-        </w:trPr>
-        <w:tc>
-          <w:tcPr>
-            <w:tcW w:type="dxa" w:w="3175"/>
-          </w:tcPr>
-          <w:p>
-            <w:pPr>
-              <w:spacing w:before="40" w:after="60" w:line="252" w:lineRule="auto"/>
-            </w:pPr>
-            <w:r>
-              <w:rPr>
-                <w:sz w:val="19"/>
+                <w:sz w:val="18"/>
               </w:rPr>
               <w:t>阀组</w:t>
               <w:br/>
@@ -1910,15 +1858,15 @@
         </w:tc>
         <w:tc>
           <w:tcPr>
-            <w:tcW w:type="dxa" w:w="2835"/>
+            <w:tcW w:type="dxa" w:w="2750"/>
           </w:tcPr>
           <w:p>
             <w:pPr>
-              <w:spacing w:before="40" w:after="60" w:line="252" w:lineRule="auto"/>
+              <w:spacing w:before="40" w:after="60" w:line="247" w:lineRule="auto"/>
             </w:pPr>
             <w:r>
               <w:rPr>
-                <w:sz w:val="19"/>
+                <w:sz w:val="18"/>
               </w:rPr>
               <w:t>控制进油、保压及受控回油，从而实现上升、停止和下降。</w:t>
             </w:r>
@@ -1926,15 +1874,15 @@
         </w:tc>
         <w:tc>
           <w:tcPr>
-            <w:tcW w:type="dxa" w:w="4309"/>
+            <w:tcW w:type="dxa" w:w="4337"/>
           </w:tcPr>
           <w:p>
             <w:pPr>
-              <w:spacing w:before="40" w:after="60" w:line="252" w:lineRule="auto"/>
+              <w:spacing w:before="40" w:after="60" w:line="247" w:lineRule="auto"/>
             </w:pPr>
             <w:r>
               <w:rPr>
-                <w:sz w:val="19"/>
+                <w:sz w:val="18"/>
               </w:rPr>
               <w:t>Controls oil admission, holding and controlled return for ascent, stopping and descent.</w:t>
             </w:r>
@@ -1947,51 +1895,51 @@
         </w:trPr>
         <w:tc>
           <w:tcPr>
-            <w:tcW w:type="dxa" w:w="3175"/>
+            <w:tcW w:type="dxa" w:w="3288"/>
           </w:tcPr>
           <w:p>
             <w:pPr>
-              <w:spacing w:before="40" w:after="60" w:line="252" w:lineRule="auto"/>
+              <w:spacing w:before="40" w:after="60" w:line="247" w:lineRule="auto"/>
             </w:pPr>
             <w:r>
               <w:rPr>
-                <w:sz w:val="19"/>
+                <w:sz w:val="18"/>
               </w:rPr>
-              <w:t>闸阀</w:t>
+              <w:t>油泵</w:t>
               <w:br/>
-              <w:t>Gate valve</w:t>
+              <w:t>Pump</w:t>
             </w:r>
           </w:p>
         </w:tc>
         <w:tc>
           <w:tcPr>
-            <w:tcW w:type="dxa" w:w="2835"/>
+            <w:tcW w:type="dxa" w:w="2750"/>
           </w:tcPr>
           <w:p>
             <w:pPr>
-              <w:spacing w:before="40" w:after="60" w:line="252" w:lineRule="auto"/>
+              <w:spacing w:before="40" w:after="60" w:line="247" w:lineRule="auto"/>
             </w:pPr>
             <w:r>
               <w:rPr>
-                <w:sz w:val="19"/>
+                <w:sz w:val="18"/>
               </w:rPr>
-              <w:t>隔离油缸油路，供检修使用；正常运行时保持开启。</w:t>
+              <w:t>由电动机驱动，将油箱中的液压油送往埋地油缸，提供顶升所需的油流。</w:t>
             </w:r>
           </w:p>
         </w:tc>
         <w:tc>
           <w:tcPr>
-            <w:tcW w:type="dxa" w:w="4309"/>
+            <w:tcW w:type="dxa" w:w="4337"/>
           </w:tcPr>
           <w:p>
             <w:pPr>
-              <w:spacing w:before="40" w:after="60" w:line="252" w:lineRule="auto"/>
+              <w:spacing w:before="40" w:after="60" w:line="247" w:lineRule="auto"/>
             </w:pPr>
             <w:r>
               <w:rPr>
-                <w:sz w:val="19"/>
+                <w:sz w:val="18"/>
               </w:rPr>
-              <w:t>Isolates the cylinder oil line for maintenance and remains open during normal operation.</w:t>
+              <w:t>Is driven by an electric motor and delivers oil from the Tank to the Cylinder in borehole to raise the Car.</w:t>
             </w:r>
           </w:p>
         </w:tc>
@@ -2002,106 +1950,51 @@
         </w:trPr>
         <w:tc>
           <w:tcPr>
-            <w:tcW w:type="dxa" w:w="3175"/>
+            <w:tcW w:type="dxa" w:w="3288"/>
           </w:tcPr>
           <w:p>
             <w:pPr>
-              <w:spacing w:before="40" w:after="60" w:line="252" w:lineRule="auto"/>
+              <w:spacing w:before="40" w:after="60" w:line="247" w:lineRule="auto"/>
             </w:pPr>
             <w:r>
               <w:rPr>
-                <w:sz w:val="19"/>
+                <w:sz w:val="18"/>
               </w:rPr>
-              <w:t>控制器</w:t>
+              <w:t>油箱</w:t>
               <w:br/>
-              <w:t>Controller</w:t>
+              <w:t>Tank</w:t>
             </w:r>
           </w:p>
         </w:tc>
         <w:tc>
           <w:tcPr>
-            <w:tcW w:type="dxa" w:w="2835"/>
+            <w:tcW w:type="dxa" w:w="2750"/>
           </w:tcPr>
           <w:p>
             <w:pPr>
-              <w:spacing w:before="40" w:after="60" w:line="252" w:lineRule="auto"/>
+              <w:spacing w:before="40" w:after="60" w:line="247" w:lineRule="auto"/>
             </w:pPr>
             <w:r>
               <w:rPr>
-                <w:sz w:val="19"/>
+                <w:sz w:val="18"/>
               </w:rPr>
-              <w:t>协调电动机、阀组、停车、平层和开关门。</w:t>
+              <w:t>储存液压油，向油泵供油，并接收下降时的回油。</w:t>
             </w:r>
           </w:p>
         </w:tc>
         <w:tc>
           <w:tcPr>
-            <w:tcW w:type="dxa" w:w="4309"/>
+            <w:tcW w:type="dxa" w:w="4337"/>
           </w:tcPr>
           <w:p>
             <w:pPr>
-              <w:spacing w:before="40" w:after="60" w:line="252" w:lineRule="auto"/>
+              <w:spacing w:before="40" w:after="60" w:line="247" w:lineRule="auto"/>
             </w:pPr>
             <w:r>
               <w:rPr>
-                <w:sz w:val="19"/>
+                <w:sz w:val="18"/>
               </w:rPr>
-              <w:t>Coordinates the motor, valve block, stopping, levelling and door operation.</w:t>
-            </w:r>
-          </w:p>
-        </w:tc>
-      </w:tr>
-      <w:tr>
-        <w:trPr>
-          <w:cantSplit/>
-        </w:trPr>
-        <w:tc>
-          <w:tcPr>
-            <w:tcW w:type="dxa" w:w="3175"/>
-          </w:tcPr>
-          <w:p>
-            <w:pPr>
-              <w:spacing w:before="40" w:after="60" w:line="252" w:lineRule="auto"/>
-            </w:pPr>
-            <w:r>
-              <w:rPr>
-                <w:sz w:val="19"/>
-              </w:rPr>
-              <w:t>轿厢导轨</w:t>
-              <w:br/>
-              <w:t>Car guide rail</w:t>
-            </w:r>
-          </w:p>
-        </w:tc>
-        <w:tc>
-          <w:tcPr>
-            <w:tcW w:type="dxa" w:w="2835"/>
-          </w:tcPr>
-          <w:p>
-            <w:pPr>
-              <w:spacing w:before="40" w:after="60" w:line="252" w:lineRule="auto"/>
-            </w:pPr>
-            <w:r>
-              <w:rPr>
-                <w:sz w:val="19"/>
-              </w:rPr>
-              <w:t>引导轿厢沿垂直路径运行。</w:t>
-            </w:r>
-          </w:p>
-        </w:tc>
-        <w:tc>
-          <w:tcPr>
-            <w:tcW w:type="dxa" w:w="4309"/>
-          </w:tcPr>
-          <w:p>
-            <w:pPr>
-              <w:spacing w:before="40" w:after="60" w:line="252" w:lineRule="auto"/>
-            </w:pPr>
-            <w:r>
-              <w:rPr>
-                <w:sz w:val="19"/>
-              </w:rPr>
-              <w:t>Guides the car vertically.</w:t>
+              <w:t>Stores oil, supplies the Pump and receives returning oil during descent.</w:t>
             </w:r>
           </w:p>
         </w:tc>
@@ -2128,9 +2021,9 @@
         <w:tblLook w:firstColumn="1" w:firstRow="1" w:lastColumn="0" w:lastRow="0" w:noHBand="0" w:noVBand="1" w:val="04A0"/>
       </w:tblPr>
       <w:tblGrid>
-        <w:gridCol w:w="3175"/>
-        <w:gridCol w:w="2835"/>
-        <w:gridCol w:w="4309"/>
+        <w:gridCol w:w="3288"/>
+        <w:gridCol w:w="2750"/>
+        <w:gridCol w:w="4337"/>
       </w:tblGrid>
       <w:tr>
         <w:trPr>
@@ -2138,19 +2031,19 @@
         </w:trPr>
         <w:tc>
           <w:tcPr>
-            <w:tcW w:type="dxa" w:w="3175"/>
-            <w:shd w:fill="E5EDF3"/>
+            <w:tcW w:type="dxa" w:w="3288"/>
+            <w:shd w:fill="E7EDF2"/>
           </w:tcPr>
           <w:p>
             <w:r>
-              <w:t>主要部件 / Major component</w:t>
+              <w:t>部件 / Component</w:t>
             </w:r>
           </w:p>
         </w:tc>
         <w:tc>
           <w:tcPr>
-            <w:tcW w:type="dxa" w:w="2835"/>
-            <w:shd w:fill="E5EDF3"/>
+            <w:tcW w:type="dxa" w:w="2750"/>
+            <w:shd w:fill="E7EDF2"/>
           </w:tcPr>
           <w:p>
             <w:r>
@@ -2160,8 +2053,8 @@
         </w:tc>
         <w:tc>
           <w:tcPr>
-            <w:tcW w:type="dxa" w:w="4309"/>
-            <w:shd w:fill="E5EDF3"/>
+            <w:tcW w:type="dxa" w:w="4337"/>
+            <w:shd w:fill="E7EDF2"/>
           </w:tcPr>
           <w:p>
             <w:r>
@@ -2176,51 +2069,51 @@
         </w:trPr>
         <w:tc>
           <w:tcPr>
-            <w:tcW w:type="dxa" w:w="3175"/>
+            <w:tcW w:type="dxa" w:w="3288"/>
           </w:tcPr>
           <w:p>
             <w:pPr>
-              <w:spacing w:before="40" w:after="60" w:line="252" w:lineRule="auto"/>
+              <w:spacing w:before="40" w:after="60" w:line="247" w:lineRule="auto"/>
             </w:pPr>
             <w:r>
               <w:rPr>
-                <w:sz w:val="19"/>
+                <w:sz w:val="18"/>
               </w:rPr>
-              <w:t>导靴</w:t>
+              <w:t>门机</w:t>
               <w:br/>
-              <w:t>Guide shoe</w:t>
+              <w:t>Door operator</w:t>
             </w:r>
           </w:p>
         </w:tc>
         <w:tc>
           <w:tcPr>
-            <w:tcW w:type="dxa" w:w="2835"/>
+            <w:tcW w:type="dxa" w:w="2750"/>
           </w:tcPr>
           <w:p>
             <w:pPr>
-              <w:spacing w:before="40" w:after="60" w:line="252" w:lineRule="auto"/>
+              <w:spacing w:before="40" w:after="60" w:line="247" w:lineRule="auto"/>
             </w:pPr>
             <w:r>
               <w:rPr>
-                <w:sz w:val="19"/>
+                <w:sz w:val="18"/>
               </w:rPr>
-              <w:t>配合轿厢导轨引导轿厢，并限制横向移动。</w:t>
+              <w:t>驱动轿门开启和关闭。</w:t>
             </w:r>
           </w:p>
         </w:tc>
         <w:tc>
           <w:tcPr>
-            <w:tcW w:type="dxa" w:w="4309"/>
+            <w:tcW w:type="dxa" w:w="4337"/>
           </w:tcPr>
           <w:p>
             <w:pPr>
-              <w:spacing w:before="40" w:after="60" w:line="252" w:lineRule="auto"/>
+              <w:spacing w:before="40" w:after="60" w:line="247" w:lineRule="auto"/>
             </w:pPr>
             <w:r>
               <w:rPr>
-                <w:sz w:val="19"/>
+                <w:sz w:val="18"/>
               </w:rPr>
-              <w:t>Runs along the car guide rail to guide the car and restrain lateral movement.</w:t>
+              <w:t>Opens and closes the Car doors.</w:t>
             </w:r>
           </w:p>
         </w:tc>
@@ -2231,51 +2124,51 @@
         </w:trPr>
         <w:tc>
           <w:tcPr>
-            <w:tcW w:type="dxa" w:w="3175"/>
+            <w:tcW w:type="dxa" w:w="3288"/>
           </w:tcPr>
           <w:p>
             <w:pPr>
-              <w:spacing w:before="40" w:after="60" w:line="252" w:lineRule="auto"/>
+              <w:spacing w:before="40" w:after="60" w:line="247" w:lineRule="auto"/>
             </w:pPr>
             <w:r>
               <w:rPr>
-                <w:sz w:val="19"/>
+                <w:sz w:val="18"/>
               </w:rPr>
-              <w:t>门机</w:t>
+              <w:t>轿门</w:t>
               <w:br/>
-              <w:t>Door operator</w:t>
+              <w:t>Car doors</w:t>
             </w:r>
           </w:p>
         </w:tc>
         <w:tc>
           <w:tcPr>
-            <w:tcW w:type="dxa" w:w="2835"/>
+            <w:tcW w:type="dxa" w:w="2750"/>
           </w:tcPr>
           <w:p>
             <w:pPr>
-              <w:spacing w:before="40" w:after="60" w:line="252" w:lineRule="auto"/>
+              <w:spacing w:before="40" w:after="60" w:line="247" w:lineRule="auto"/>
             </w:pPr>
             <w:r>
               <w:rPr>
-                <w:sz w:val="19"/>
+                <w:sz w:val="18"/>
               </w:rPr>
-              <w:t>驱动轿门开启和关闭。</w:t>
+              <w:t>关闭轿厢入口；正常运行时保持关闭。</w:t>
             </w:r>
           </w:p>
         </w:tc>
         <w:tc>
           <w:tcPr>
-            <w:tcW w:type="dxa" w:w="4309"/>
+            <w:tcW w:type="dxa" w:w="4337"/>
           </w:tcPr>
           <w:p>
             <w:pPr>
-              <w:spacing w:before="40" w:after="60" w:line="252" w:lineRule="auto"/>
+              <w:spacing w:before="40" w:after="60" w:line="247" w:lineRule="auto"/>
             </w:pPr>
             <w:r>
               <w:rPr>
-                <w:sz w:val="19"/>
+                <w:sz w:val="18"/>
               </w:rPr>
-              <w:t>Opens and closes the car doors.</w:t>
+              <w:t>Close the Car entrance and remain closed during normal travel.</w:t>
             </w:r>
           </w:p>
         </w:tc>
@@ -2286,51 +2179,51 @@
         </w:trPr>
         <w:tc>
           <w:tcPr>
-            <w:tcW w:type="dxa" w:w="3175"/>
+            <w:tcW w:type="dxa" w:w="3288"/>
           </w:tcPr>
           <w:p>
             <w:pPr>
-              <w:spacing w:before="40" w:after="60" w:line="252" w:lineRule="auto"/>
+              <w:spacing w:before="40" w:after="60" w:line="247" w:lineRule="auto"/>
             </w:pPr>
             <w:r>
               <w:rPr>
-                <w:sz w:val="19"/>
+                <w:sz w:val="18"/>
               </w:rPr>
-              <w:t>轿门</w:t>
+              <w:t>随行电缆</w:t>
               <w:br/>
-              <w:t>Car doors</w:t>
+              <w:t>Travelling cables</w:t>
             </w:r>
           </w:p>
         </w:tc>
         <w:tc>
           <w:tcPr>
-            <w:tcW w:type="dxa" w:w="2835"/>
+            <w:tcW w:type="dxa" w:w="2750"/>
           </w:tcPr>
           <w:p>
             <w:pPr>
-              <w:spacing w:before="40" w:after="60" w:line="252" w:lineRule="auto"/>
+              <w:spacing w:before="40" w:after="60" w:line="247" w:lineRule="auto"/>
             </w:pPr>
             <w:r>
               <w:rPr>
-                <w:sz w:val="19"/>
+                <w:sz w:val="18"/>
               </w:rPr>
-              <w:t>关闭轿厢入口。</w:t>
+              <w:t>连接固定设备和移动轿厢，传送电源及控制信号。</w:t>
             </w:r>
           </w:p>
         </w:tc>
         <w:tc>
           <w:tcPr>
-            <w:tcW w:type="dxa" w:w="4309"/>
+            <w:tcW w:type="dxa" w:w="4337"/>
           </w:tcPr>
           <w:p>
             <w:pPr>
-              <w:spacing w:before="40" w:after="60" w:line="252" w:lineRule="auto"/>
+              <w:spacing w:before="40" w:after="60" w:line="247" w:lineRule="auto"/>
             </w:pPr>
             <w:r>
               <w:rPr>
-                <w:sz w:val="19"/>
+                <w:sz w:val="18"/>
               </w:rPr>
-              <w:t>Close the car entrance.</w:t>
+              <w:t>Carry power and control signals between fixed equipment and the moving Car.</w:t>
             </w:r>
           </w:p>
         </w:tc>
@@ -2341,51 +2234,51 @@
         </w:trPr>
         <w:tc>
           <w:tcPr>
-            <w:tcW w:type="dxa" w:w="3175"/>
+            <w:tcW w:type="dxa" w:w="3288"/>
           </w:tcPr>
           <w:p>
             <w:pPr>
-              <w:spacing w:before="40" w:after="60" w:line="252" w:lineRule="auto"/>
+              <w:spacing w:before="40" w:after="60" w:line="247" w:lineRule="auto"/>
             </w:pPr>
             <w:r>
               <w:rPr>
-                <w:sz w:val="19"/>
+                <w:sz w:val="18"/>
               </w:rPr>
-              <w:t>层门</w:t>
+              <w:t>层站指示器</w:t>
               <w:br/>
-              <w:t>Landing doors</w:t>
+              <w:t>Landing indicator</w:t>
             </w:r>
           </w:p>
         </w:tc>
         <w:tc>
           <w:tcPr>
-            <w:tcW w:type="dxa" w:w="2835"/>
+            <w:tcW w:type="dxa" w:w="2750"/>
           </w:tcPr>
           <w:p>
             <w:pPr>
-              <w:spacing w:before="40" w:after="60" w:line="252" w:lineRule="auto"/>
+              <w:spacing w:before="40" w:after="60" w:line="247" w:lineRule="auto"/>
             </w:pPr>
             <w:r>
               <w:rPr>
-                <w:sz w:val="19"/>
+                <w:sz w:val="18"/>
               </w:rPr>
-              <w:t>关闭各楼层通向井道的入口。</w:t>
+              <w:t>显示楼层或运行方向等信息。</w:t>
             </w:r>
           </w:p>
         </w:tc>
         <w:tc>
           <w:tcPr>
-            <w:tcW w:type="dxa" w:w="4309"/>
+            <w:tcW w:type="dxa" w:w="4337"/>
           </w:tcPr>
           <w:p>
             <w:pPr>
-              <w:spacing w:before="40" w:after="60" w:line="252" w:lineRule="auto"/>
+              <w:spacing w:before="40" w:after="60" w:line="247" w:lineRule="auto"/>
             </w:pPr>
             <w:r>
               <w:rPr>
-                <w:sz w:val="19"/>
+                <w:sz w:val="18"/>
               </w:rPr>
-              <w:t>Close the well entrance at each landing.</w:t>
+              <w:t>Displays information such as floor position or direction.</w:t>
             </w:r>
           </w:p>
         </w:tc>
@@ -2396,51 +2289,51 @@
         </w:trPr>
         <w:tc>
           <w:tcPr>
-            <w:tcW w:type="dxa" w:w="3175"/>
+            <w:tcW w:type="dxa" w:w="3288"/>
           </w:tcPr>
           <w:p>
             <w:pPr>
-              <w:spacing w:before="40" w:after="60" w:line="252" w:lineRule="auto"/>
+              <w:spacing w:before="40" w:after="60" w:line="247" w:lineRule="auto"/>
             </w:pPr>
             <w:r>
               <w:rPr>
-                <w:sz w:val="19"/>
+                <w:sz w:val="18"/>
               </w:rPr>
-              <w:t>层门联锁</w:t>
+              <w:t>层站按钮</w:t>
               <w:br/>
-              <w:t>Landing door interlock</w:t>
+              <w:t>Landing pushbutton</w:t>
             </w:r>
           </w:p>
         </w:tc>
         <w:tc>
           <w:tcPr>
-            <w:tcW w:type="dxa" w:w="2835"/>
+            <w:tcW w:type="dxa" w:w="2750"/>
           </w:tcPr>
           <w:p>
             <w:pPr>
-              <w:spacing w:before="40" w:after="60" w:line="252" w:lineRule="auto"/>
+              <w:spacing w:before="40" w:after="60" w:line="247" w:lineRule="auto"/>
             </w:pPr>
             <w:r>
               <w:rPr>
-                <w:sz w:val="19"/>
+                <w:sz w:val="18"/>
               </w:rPr>
-              <w:t>层门未正确关闭并锁紧时，阻止正常运行。</w:t>
+              <w:t>向控制器发出召梯指令。</w:t>
             </w:r>
           </w:p>
         </w:tc>
         <w:tc>
           <w:tcPr>
-            <w:tcW w:type="dxa" w:w="4309"/>
+            <w:tcW w:type="dxa" w:w="4337"/>
           </w:tcPr>
           <w:p>
             <w:pPr>
-              <w:spacing w:before="40" w:after="60" w:line="252" w:lineRule="auto"/>
+              <w:spacing w:before="40" w:after="60" w:line="247" w:lineRule="auto"/>
             </w:pPr>
             <w:r>
               <w:rPr>
-                <w:sz w:val="19"/>
+                <w:sz w:val="18"/>
               </w:rPr>
-              <w:t>Prevents normal travel unless the landing doors are properly closed and locked.</w:t>
+              <w:t>Registers a landing call with the Controller.</w:t>
             </w:r>
           </w:p>
         </w:tc>
@@ -2451,51 +2344,51 @@
         </w:trPr>
         <w:tc>
           <w:tcPr>
-            <w:tcW w:type="dxa" w:w="3175"/>
+            <w:tcW w:type="dxa" w:w="3288"/>
           </w:tcPr>
           <w:p>
             <w:pPr>
-              <w:spacing w:before="40" w:after="60" w:line="252" w:lineRule="auto"/>
+              <w:spacing w:before="40" w:after="60" w:line="247" w:lineRule="auto"/>
             </w:pPr>
             <w:r>
               <w:rPr>
-                <w:sz w:val="19"/>
+                <w:sz w:val="18"/>
               </w:rPr>
-              <w:t>层门接近传感器</w:t>
+              <w:t>层门</w:t>
               <w:br/>
-              <w:t>Landing door proximity sensor</w:t>
+              <w:t>Landing doors</w:t>
             </w:r>
           </w:p>
         </w:tc>
         <w:tc>
           <w:tcPr>
-            <w:tcW w:type="dxa" w:w="2835"/>
+            <w:tcW w:type="dxa" w:w="2750"/>
           </w:tcPr>
           <w:p>
             <w:pPr>
-              <w:spacing w:before="40" w:after="60" w:line="252" w:lineRule="auto"/>
+              <w:spacing w:before="40" w:after="60" w:line="247" w:lineRule="auto"/>
             </w:pPr>
             <w:r>
               <w:rPr>
-                <w:sz w:val="19"/>
+                <w:sz w:val="18"/>
               </w:rPr>
-              <w:t>关门期间检测到乘客进入时，使门重新打开。</w:t>
+              <w:t>关闭各楼层的井道入口；其联锁防止门未关闭锁紧时正常运行。</w:t>
             </w:r>
           </w:p>
         </w:tc>
         <w:tc>
           <w:tcPr>
-            <w:tcW w:type="dxa" w:w="4309"/>
+            <w:tcW w:type="dxa" w:w="4337"/>
           </w:tcPr>
           <w:p>
             <w:pPr>
-              <w:spacing w:before="40" w:after="60" w:line="252" w:lineRule="auto"/>
+              <w:spacing w:before="40" w:after="60" w:line="247" w:lineRule="auto"/>
             </w:pPr>
             <w:r>
               <w:rPr>
-                <w:sz w:val="19"/>
+                <w:sz w:val="18"/>
               </w:rPr>
-              <w:t>Causes closing doors to reopen when a person enters.</w:t>
+              <w:t>Close the Lift well entrance at each landing; their interlocks prevent normal travel unless they are closed and locked.</w:t>
             </w:r>
           </w:p>
         </w:tc>
@@ -2506,51 +2399,51 @@
         </w:trPr>
         <w:tc>
           <w:tcPr>
-            <w:tcW w:type="dxa" w:w="3175"/>
+            <w:tcW w:type="dxa" w:w="3288"/>
           </w:tcPr>
           <w:p>
             <w:pPr>
-              <w:spacing w:before="40" w:after="60" w:line="252" w:lineRule="auto"/>
+              <w:spacing w:before="40" w:after="60" w:line="247" w:lineRule="auto"/>
             </w:pPr>
             <w:r>
               <w:rPr>
-                <w:sz w:val="19"/>
+                <w:sz w:val="18"/>
               </w:rPr>
-              <w:t>楼层停止及限位开关</w:t>
+              <w:t>密封套</w:t>
               <w:br/>
-              <w:t>Floor stop and limit switch</w:t>
+              <w:t>Collar</w:t>
             </w:r>
           </w:p>
         </w:tc>
         <w:tc>
           <w:tcPr>
-            <w:tcW w:type="dxa" w:w="2835"/>
+            <w:tcW w:type="dxa" w:w="2750"/>
           </w:tcPr>
           <w:p>
             <w:pPr>
-              <w:spacing w:before="40" w:after="60" w:line="252" w:lineRule="auto"/>
+              <w:spacing w:before="40" w:after="60" w:line="247" w:lineRule="auto"/>
             </w:pPr>
             <w:r>
               <w:rPr>
-                <w:sz w:val="19"/>
+                <w:sz w:val="18"/>
               </w:rPr>
-              <w:t>控制楼层停车并限制轿厢行程。</w:t>
+              <w:t>在埋地油缸入口处引导柱塞，并配合密封组件限制油液泄漏。</w:t>
             </w:r>
           </w:p>
         </w:tc>
         <w:tc>
           <w:tcPr>
-            <w:tcW w:type="dxa" w:w="4309"/>
+            <w:tcW w:type="dxa" w:w="4337"/>
           </w:tcPr>
           <w:p>
             <w:pPr>
-              <w:spacing w:before="40" w:after="60" w:line="252" w:lineRule="auto"/>
+              <w:spacing w:before="40" w:after="60" w:line="247" w:lineRule="auto"/>
             </w:pPr>
             <w:r>
               <w:rPr>
-                <w:sz w:val="19"/>
+                <w:sz w:val="18"/>
               </w:rPr>
-              <w:t>Controls landing stops and limits car travel.</w:t>
+              <w:t>Guides the Piston at the cylinder entrance and works with the sealing arrangement to limit oil leakage.</w:t>
             </w:r>
           </w:p>
         </w:tc>
@@ -2561,161 +2454,51 @@
         </w:trPr>
         <w:tc>
           <w:tcPr>
-            <w:tcW w:type="dxa" w:w="3175"/>
+            <w:tcW w:type="dxa" w:w="3288"/>
           </w:tcPr>
           <w:p>
             <w:pPr>
-              <w:spacing w:before="40" w:after="60" w:line="252" w:lineRule="auto"/>
+              <w:spacing w:before="40" w:after="60" w:line="247" w:lineRule="auto"/>
             </w:pPr>
             <w:r>
               <w:rPr>
-                <w:sz w:val="19"/>
+                <w:sz w:val="18"/>
               </w:rPr>
-              <w:t>低速平层开关凸轮</w:t>
+              <w:t>埋地油缸</w:t>
               <w:br/>
-              <w:t>Creepage and leveling switch cam</w:t>
+              <w:t>Cylinder in borehole</w:t>
             </w:r>
           </w:p>
         </w:tc>
         <w:tc>
           <w:tcPr>
-            <w:tcW w:type="dxa" w:w="2835"/>
+            <w:tcW w:type="dxa" w:w="2750"/>
           </w:tcPr>
           <w:p>
             <w:pPr>
-              <w:spacing w:before="40" w:after="60" w:line="252" w:lineRule="auto"/>
+              <w:spacing w:before="40" w:after="60" w:line="247" w:lineRule="auto"/>
             </w:pPr>
             <w:r>
               <w:rPr>
-                <w:sz w:val="19"/>
+                <w:sz w:val="18"/>
               </w:rPr>
-              <w:t>触发相关开关，使系统进行低速平层。</w:t>
+              <w:t>容纳受压液压油，与柱塞形成直接顶升机构；埋地部分容纳所需行程。</w:t>
             </w:r>
           </w:p>
         </w:tc>
         <w:tc>
           <w:tcPr>
-            <w:tcW w:type="dxa" w:w="4309"/>
+            <w:tcW w:type="dxa" w:w="4337"/>
           </w:tcPr>
           <w:p>
             <w:pPr>
-              <w:spacing w:before="40" w:after="60" w:line="252" w:lineRule="auto"/>
+              <w:spacing w:before="40" w:after="60" w:line="247" w:lineRule="auto"/>
             </w:pPr>
             <w:r>
               <w:rPr>
-                <w:sz w:val="19"/>
+                <w:sz w:val="18"/>
               </w:rPr>
-              <w:t>Actuates the associated switches for low-speed levelling.</w:t>
-            </w:r>
-          </w:p>
-        </w:tc>
-      </w:tr>
-      <w:tr>
-        <w:trPr>
-          <w:cantSplit/>
-        </w:trPr>
-        <w:tc>
-          <w:tcPr>
-            <w:tcW w:type="dxa" w:w="3175"/>
-          </w:tcPr>
-          <w:p>
-            <w:pPr>
-              <w:spacing w:before="40" w:after="60" w:line="252" w:lineRule="auto"/>
-            </w:pPr>
-            <w:r>
-              <w:rPr>
-                <w:sz w:val="19"/>
-              </w:rPr>
-              <w:t>弹簧缓冲器</w:t>
-              <w:br/>
-              <w:t>Buffer spring</w:t>
-            </w:r>
-          </w:p>
-        </w:tc>
-        <w:tc>
-          <w:tcPr>
-            <w:tcW w:type="dxa" w:w="2835"/>
-          </w:tcPr>
-          <w:p>
-            <w:pPr>
-              <w:spacing w:before="40" w:after="60" w:line="252" w:lineRule="auto"/>
-            </w:pPr>
-            <w:r>
-              <w:rPr>
-                <w:sz w:val="19"/>
-              </w:rPr>
-              <w:t>在轿厢底部越程时吸收冲击能量。</w:t>
-            </w:r>
-          </w:p>
-        </w:tc>
-        <w:tc>
-          <w:tcPr>
-            <w:tcW w:type="dxa" w:w="4309"/>
-          </w:tcPr>
-          <w:p>
-            <w:pPr>
-              <w:spacing w:before="40" w:after="60" w:line="252" w:lineRule="auto"/>
-            </w:pPr>
-            <w:r>
-              <w:rPr>
-                <w:sz w:val="19"/>
-              </w:rPr>
-              <w:t>Absorbs impact energy during bottom overtravel of the car.</w:t>
-            </w:r>
-          </w:p>
-        </w:tc>
-      </w:tr>
-      <w:tr>
-        <w:trPr>
-          <w:cantSplit/>
-        </w:trPr>
-        <w:tc>
-          <w:tcPr>
-            <w:tcW w:type="dxa" w:w="3175"/>
-          </w:tcPr>
-          <w:p>
-            <w:pPr>
-              <w:spacing w:before="40" w:after="60" w:line="252" w:lineRule="auto"/>
-            </w:pPr>
-            <w:r>
-              <w:rPr>
-                <w:sz w:val="19"/>
-              </w:rPr>
-              <w:t>随行电缆</w:t>
-              <w:br/>
-              <w:t>Travelling cables</w:t>
-            </w:r>
-          </w:p>
-        </w:tc>
-        <w:tc>
-          <w:tcPr>
-            <w:tcW w:type="dxa" w:w="2835"/>
-          </w:tcPr>
-          <w:p>
-            <w:pPr>
-              <w:spacing w:before="40" w:after="60" w:line="252" w:lineRule="auto"/>
-            </w:pPr>
-            <w:r>
-              <w:rPr>
-                <w:sz w:val="19"/>
-              </w:rPr>
-              <w:t>在固定设备与移动轿厢之间传送电源及控制信号。</w:t>
-            </w:r>
-          </w:p>
-        </w:tc>
-        <w:tc>
-          <w:tcPr>
-            <w:tcW w:type="dxa" w:w="4309"/>
-          </w:tcPr>
-          <w:p>
-            <w:pPr>
-              <w:spacing w:before="40" w:after="60" w:line="252" w:lineRule="auto"/>
-            </w:pPr>
-            <w:r>
-              <w:rPr>
-                <w:sz w:val="19"/>
-              </w:rPr>
-              <w:t>Carry power and control signals between fixed equipment and the moving car.</w:t>
+              <w:t>Contains pressurised oil and forms the direct lifting actuator with the Piston; its buried length accommodates the required travel.</w:t>
             </w:r>
           </w:p>
         </w:tc>
@@ -2731,23 +2514,18 @@
     </w:p>
     <w:p>
       <w:r>
-        <w:t>上升时，电动机驱动油泵，液压油经阀组和闸阀进入油缸，使柱塞伸出并直接顶升轿厢。停止时，阀组保持油缸内的油液。下降时，阀组控制油液回流油箱的速度，使柱塞及轿厢受控下降。正常运行时闸阀保持开启。</w:t>
+        <w:t>上升：控制器启动油泵，油经阀组进入埋地油缸，使柱塞伸出并直接顶升轿厢。停止：油泵停止供油，阀组保持油缸内的油液，使轿厢停留在所需位置。下降：阀组控制回油速度，使柱塞和轿厢受控下降。平层后停止回油，轿厢保持静止，再开门。</w:t>
       </w:r>
     </w:p>
     <w:p>
       <w:r>
-        <w:t>During ascent, the motor drives the pump, and oil enters the cylinder through the valve block and gate valve, extending the plunger and directly raising the car. During holding, the valve block retains oil in the cylinder. During descent, it controls the rate of return to the tank so that the plunger and car descend in a controlled manner. The gate valve remains open during normal operation.</w:t>
+        <w:t>Ascent: the Controller operates the Pump, and oil passes through the Valve block into the Cylinder in borehole, extending the Piston and raising the Car directly. Holding: the Pump stops delivering oil, and the Valve block retains oil to hold the Car at the required position. Descent: the Valve block controls the return flow so that the Piston and Car descend in a controlled manner. After levelling, return flow stops and the Car remains stationary before the doors open.</w:t>
       </w:r>
     </w:p>
     <w:p>
-      <w:pPr>
-        <w:sectPr>
-          <w:pgSz w:w="11906" w:h="16838"/>
-          <w:pgMar w:top="794" w:right="794" w:bottom="794" w:left="794" w:header="340" w:footer="340" w:gutter="0"/>
-          <w:cols w:space="720"/>
-          <w:docGrid w:linePitch="360"/>
-        </w:sectPr>
-      </w:pPr>
+      <w:r>
+        <w:br w:type="page"/>
+      </w:r>
     </w:p>
     <w:p>
       <w:pPr>
@@ -2757,7 +2535,7 @@
       <w:r>
         <w:drawing>
           <wp:inline xmlns:a="http://schemas.openxmlformats.org/drawingml/2006/main" xmlns:pic="http://schemas.openxmlformats.org/drawingml/2006/picture">
-            <wp:extent cx="9540000" cy="6748658"/>
+            <wp:extent cx="6588000" cy="9312788"/>
             <wp:docPr id="2" name="Picture 2"/>
             <wp:cNvGraphicFramePr>
               <a:graphicFrameLocks noChangeAspect="1"/>
@@ -2766,7 +2544,7 @@
               <a:graphicData uri="http://schemas.openxmlformats.org/drawingml/2006/picture">
                 <pic:pic>
                   <pic:nvPicPr>
-                    <pic:cNvPr id="0" name="PIA5704_Q1_Hydraulic_Clear.png"/>
+                    <pic:cNvPr id="0" name="PIA5704_Q1_Hydraulic_PPT_Matched.png"/>
                     <pic:cNvPicPr/>
                   </pic:nvPicPr>
                   <pic:blipFill>
@@ -2778,7 +2556,7 @@
                   <pic:spPr>
                     <a:xfrm>
                       <a:off x="0" y="0"/>
-                      <a:ext cx="9540000" cy="6748658"/>
+                      <a:ext cx="6588000" cy="9312788"/>
                     </a:xfrm>
                     <a:prstGeom prst="rect"/>
                   </pic:spPr>
@@ -2790,8 +2568,10 @@
       </w:r>
     </w:p>
     <w:sectPr>
-      <w:pgSz w:w="16838" w:h="11906" w:orient="landscape"/>
-      <w:pgMar w:top="794" w:right="794" w:bottom="794" w:left="794" w:header="340" w:footer="340" w:gutter="0"/>
+      <w:headerReference w:type="default" r:id="rId9"/>
+      <w:footerReference w:type="default" r:id="rId10"/>
+      <w:pgSz w:w="11906" w:h="16838"/>
+      <w:pgMar w:top="680" w:right="765" w:bottom="680" w:left="765" w:header="283" w:footer="283" w:gutter="0"/>
       <w:cols w:space="720"/>
       <w:docGrid w:linePitch="360"/>
     </w:sectPr>
@@ -3188,11 +2968,11 @@
     <w:qFormat/>
     <w:rsid w:val="00FC693F"/>
     <w:pPr>
-      <w:spacing w:after="100"/>
+      <w:spacing w:after="80"/>
     </w:pPr>
     <w:rPr>
       <w:rFonts w:ascii="Calibri" w:hAnsi="Calibri" w:eastAsia="Noto Sans CJK SC"/>
-      <w:sz w:val="21"/>
+      <w:sz w:val="20"/>
     </w:rPr>
   </w:style>
   <w:style w:type="paragraph" w:styleId="Header">
@@ -3257,8 +3037,8 @@
       <w:rFonts w:asciiTheme="majorHAnsi" w:eastAsiaTheme="majorEastAsia" w:hAnsiTheme="majorHAnsi" w:cstheme="majorBidi" w:ascii="Calibri" w:hAnsi="Calibri" w:eastAsia="Noto Sans CJK SC"/>
       <w:b/>
       <w:bCs/>
-      <w:color w:val="17364D"/>
-      <w:sz w:val="32"/>
+      <w:color w:val="365F91" w:themeColor="accent1" w:themeShade="BF"/>
+      <w:sz w:val="30"/>
       <w:szCs w:val="28"/>
     </w:rPr>
   </w:style>
@@ -3281,7 +3061,7 @@
       <w:rFonts w:asciiTheme="majorHAnsi" w:eastAsiaTheme="majorEastAsia" w:hAnsiTheme="majorHAnsi" w:cstheme="majorBidi" w:ascii="Calibri" w:hAnsi="Calibri" w:eastAsia="Noto Sans CJK SC"/>
       <w:b/>
       <w:bCs/>
-      <w:color w:val="17364D"/>
+      <w:color w:val="4F81BD" w:themeColor="accent1"/>
       <w:sz w:val="24"/>
       <w:szCs w:val="26"/>
     </w:rPr>
@@ -3544,10 +3324,10 @@
     </w:pPr>
     <w:rPr>
       <w:rFonts w:asciiTheme="majorHAnsi" w:eastAsiaTheme="majorEastAsia" w:hAnsiTheme="majorHAnsi" w:cstheme="majorBidi" w:ascii="Calibri" w:hAnsi="Calibri" w:eastAsia="Noto Sans CJK SC"/>
-      <w:color w:val="17364D"/>
+      <w:color w:val="17365D" w:themeColor="text2" w:themeShade="BF"/>
       <w:spacing w:val="5"/>
       <w:kern w:val="28"/>
-      <w:sz w:val="40"/>
+      <w:sz w:val="38"/>
       <w:szCs w:val="52"/>
     </w:rPr>
   </w:style>
@@ -3989,7 +3769,7 @@
       <w:b/>
       <w:bCs/>
       <w:color w:val="4F81BD" w:themeColor="accent1"/>
-      <w:sz w:val="21"/>
+      <w:sz w:val="20"/>
       <w:szCs w:val="18"/>
     </w:rPr>
   </w:style>
@@ -4141,7 +3921,7 @@
     </w:pPr>
     <w:rPr>
       <w:rFonts w:ascii="Calibri" w:hAnsi="Calibri" w:eastAsia="Noto Sans CJK SC"/>
-      <w:sz w:val="21"/>
+      <w:sz w:val="20"/>
     </w:rPr>
     <w:tblPr>
       <w:tblInd w:w="0" w:type="dxa"/>

</xml_diff>